<commit_message>
Update E-101 task pack and notes for the Oct 19 Writer Guidelines
- Script: no OTA or TaskRecorder sign-in, account-corner and Save-window PII
  checks, new desktop setup, Major vs Minor AutoQC flags, CC0 wording at first
  use, typed text read back, six official epilogue topics (max 4:00).
- Review Lessons: stale rules corrected, new section 11.
- Allowed_Apps.md and Restricted_Apps.md marked superseded by App_Policy.md.

Co-Authored-By: Claude Sonnet 5.5 <noreply@anthropic.com>
Claude-Session: https://claude.ai/code/session_01Gm6cMKt8gvcTBmYZnmf5pq
</commit_message>
<xml_diff>
--- a/task-pack/E-101 Fouling Check - Timed Script.docx
+++ b/task-pack/E-101 Fouling Check - Timed Script.docx
@@ -15,7 +15,7 @@
         <w:spacing w:after="120"/>
       </w:pPr>
       <w:r>
-        <w:t>Oct 20, 2026 · @Chinmay</w:t>
+        <w:t>Oct 22, 2026 · @Chinmay · updated for the Oct 19, 2026 Writer Guidelines</w:t>
       </w:r>
     </w:p>
     <w:p>
@@ -31,7 +31,7 @@
         <w:spacing w:after="120"/>
       </w:pPr>
       <w:r>
-        <w:t>This script has 19 minutes 40 seconds of speaking and doing, plus a separate epilogue of about 3:28. It is built for a video of about 37 minutes. Your earlier videos ran about 1.6 times the script time, and you will speak slowly with a pause after every click, so I planned the working part at 1.7 times. The epilogue is spoken only, so it is counted at real time. That keeps a wide margin above the 15:00 minimum and below the 50:59 cap. It uses the same layout as your droplet script, and it is written to avoid the mistakes a reviewer flagged on another task, listed below.</w:t>
+        <w:t>This script has 20 minutes 15 seconds of speaking and doing, plus a separate epilogue of about 3:20. It is built for a video of about 38 minutes. Your earlier videos ran about 1.6 times the script time, and you will speak slowly with a pause after every click, so I planned the working part at 1.7 times. The epilogue is spoken only, so it is counted at real time. That keeps a wide margin above the 15:00 minimum and below the 50:59 planning limit. It uses the same layout as your droplet script, and it is written to avoid the mistakes reviewers flag, listed below.</w:t>
       </w:r>
     </w:p>
     <w:tbl>
@@ -123,7 +123,7 @@
               <w:rPr>
                 <w:sz w:val="19"/>
               </w:rPr>
-              <w:t>What and Why were fine, Where was missing. Say which part of the screen you click, every time.</w:t>
+              <w:t>What and Why were fine, Where was missing. Small clicks such as a Save button, an Explorer icon or a minimize button were never narrated.</w:t>
             </w:r>
           </w:p>
         </w:tc>
@@ -137,7 +137,7 @@
               <w:rPr>
                 <w:sz w:val="19"/>
               </w:rPr>
-              <w:t>Every click names the control and its place: the Dock along the left edge, the menu bar along the top, the yellow button in the top left corner, the Run arrow at the left edge of the cell, the Explorer sidebar on the left, the slide thumbnails on the left, the ribbon across the top.</w:t>
+              <w:t>Every click names the control and its place, including the small ones: the Dock along the left edge, the menu bar along the top, the yellow button in the top left corner, the Save button at the bottom right of the window, the Run arrow at the left edge of the cell, the Explorer sidebar on the left, the slide thumbnails on the left, the ribbon across the top.</w:t>
             </w:r>
           </w:p>
         </w:tc>
@@ -227,7 +227,7 @@
               <w:rPr>
                 <w:sz w:val="19"/>
               </w:rPr>
-              <w:t>The pointer only moves to name something, never to look busy. It is never still for more than 20 seconds, and the Writer Guidelines limit is 45. Every typing burst is a few characters or one line of at most 30 seconds, and the pointer goes back to the result right after it.</w:t>
+              <w:t>The pointer only moves to name something, never to look busy. It is never still for more than 20 seconds, and the Writer Guidelines limit is 45 outside the epilogue. Every typing burst is a few characters or one line of at most 30 seconds, and the pointer goes back to the result right after it.</w:t>
             </w:r>
           </w:p>
         </w:tc>
@@ -243,7 +243,7 @@
               <w:rPr>
                 <w:sz w:val="19"/>
               </w:rPr>
-              <w:t>Narration must be clear enough to follow without the screen. No muttering, no background noise, no here or this.</w:t>
+              <w:t>Narration must pass the eyes-closed test: no 'click here', no 'change this', no muttering.</w:t>
             </w:r>
           </w:p>
         </w:tc>
@@ -257,7 +257,37 @@
               <w:rPr>
                 <w:sz w:val="19"/>
               </w:rPr>
-              <w:t>Each line gives the action, the exact control, its location and the reason, using real names. Audio rules below, plus a test recording before you start.</w:t>
+              <w:t>Each line gives the action, the exact control, its location and the reason, using real names. Everything you type is read back aloud afterwards, so a listener who cannot see the screen still knows what was typed.</w:t>
+            </w:r>
+          </w:p>
+        </w:tc>
+      </w:tr>
+      <w:tr>
+        <w:tc>
+          <w:tcPr>
+            <w:tcW w:type="dxa" w:w="4320"/>
+          </w:tcPr>
+          <w:p>
+            <w:r/>
+            <w:r>
+              <w:rPr>
+                <w:sz w:val="19"/>
+              </w:rPr>
+              <w:t>A name and profile photo sat in PowerPoint's top right corner at 22:10. A username showed in a Save window.</w:t>
+            </w:r>
+          </w:p>
+        </w:tc>
+        <w:tc>
+          <w:tcPr>
+            <w:tcW w:type="dxa" w:w="5040"/>
+          </w:tcPr>
+          <w:p>
+            <w:r/>
+            <w:r>
+              <w:rPr>
+                <w:sz w:val="19"/>
+              </w:rPr>
+              <w:t>Setup items 5 and 6 below check the account corner of Word, PowerPoint and VS Code, and every Save, Export and file window, in a dry run before you record. PII is never tolerated and always sends a task back.</w:t>
             </w:r>
           </w:p>
         </w:tc>
@@ -270,24 +300,132 @@
     </w:p>
     <w:p>
       <w:pPr>
-        <w:spacing w:after="120"/>
-      </w:pPr>
+        <w:pStyle w:val="Heading3"/>
+      </w:pPr>
+      <w:r>
+        <w:t>What changed from the earlier version of this script</w:t>
+      </w:r>
+    </w:p>
+    <w:p>
+      <w:pPr>
+        <w:pStyle w:val="ListParagraph"/>
+        <w:spacing w:after="100"/>
+        <w:ind w:left="432"/>
+      </w:pPr>
+      <w:r>
+        <w:t xml:space="preserve">1.  </w:t>
+      </w:r>
       <w:r>
         <w:rPr>
           <w:b/>
         </w:rPr>
-        <w:t>What is new compared with your droplet script:</w:t>
-      </w:r>
-      <w:r>
-        <w:t xml:space="preserve"> the epilogue is now required, so the recording must end with a 3 to 4 minute spoken summary, never over 4:00, before you bring TaskRecorder back. Recording length is now 15:00 to 50:59 including the intro and the epilogue. The files use your droplet naming: you type final_output_1.ipynb, final_output_3.docx, final_output_4.pptx and final_output_5 in the Save As and Export windows, so the deliverables already have their names. The starter notebook, the memo template and the deck template stay untouched. Use the new zip, fouling_task_inputs.zip.</w:t>
+        <w:t>Accounts.</w:t>
+      </w:r>
+      <w:r>
+        <w:t xml:space="preserve"> TaskRecorder 2.4.4 needs no sign-in, and assigned OTA accounts are retired. Word and PowerPoint use your mercor.expert account or a new anonymised account.</w:t>
       </w:r>
     </w:p>
     <w:p>
       <w:pPr>
+        <w:pStyle w:val="ListParagraph"/>
+        <w:spacing w:after="100"/>
+        <w:ind w:left="432"/>
+      </w:pPr>
+      <w:r>
+        <w:t xml:space="preserve">2.  </w:t>
+      </w:r>
+      <w:r>
+        <w:rPr>
+          <w:b/>
+        </w:rPr>
+        <w:t>Setup.</w:t>
+      </w:r>
+      <w:r>
+        <w:t xml:space="preserve"> A separate Recorder account is now optional. Clear the Desktop, use a built-in wallpaper, turn on Do Not Disturb, give your Mac a neutral name, keep the Dock on the left or right with auto-hide off, and run a 10-second test recording.</w:t>
+      </w:r>
+    </w:p>
+    <w:p>
+      <w:pPr>
+        <w:pStyle w:val="ListParagraph"/>
+        <w:spacing w:after="100"/>
+        <w:ind w:left="432"/>
+      </w:pPr>
+      <w:r>
+        <w:t xml:space="preserve">3.  </w:t>
+      </w:r>
+      <w:r>
+        <w:rPr>
+          <w:b/>
+        </w:rPr>
+        <w:t>Apps.</w:t>
+      </w:r>
+      <w:r>
+        <w:t xml:space="preserve"> The approved-app list is retired. Visual Studio Code, Word and PowerPoint are not on the banned or limited-use lists in App_Policy.md. Terminal is allowed (alternatives preferred) and is only used after recording.</w:t>
+      </w:r>
+    </w:p>
+    <w:p>
+      <w:pPr>
+        <w:pStyle w:val="ListParagraph"/>
+        <w:spacing w:after="100"/>
+        <w:ind w:left="432"/>
+      </w:pPr>
+      <w:r>
+        <w:t xml:space="preserve">4.  </w:t>
+      </w:r>
+      <w:r>
+        <w:rPr>
+          <w:b/>
+        </w:rPr>
+        <w:t>AutoQC.</w:t>
+      </w:r>
+      <w:r>
+        <w:t xml:space="preserve"> Only Major flags block submission. Minor flags are advice, and a file or metadata problem needs a corrected upload, not a re-record. After you submit, the status reads Ready for Review.</w:t>
+      </w:r>
+    </w:p>
+    <w:p>
+      <w:pPr>
+        <w:pStyle w:val="ListParagraph"/>
+        <w:spacing w:after="100"/>
+        <w:ind w:left="432"/>
+      </w:pPr>
+      <w:r>
+        <w:t xml:space="preserve">5.  </w:t>
+      </w:r>
+      <w:r>
+        <w:rPr>
+          <w:b/>
+        </w:rPr>
+        <w:t>Wording.</w:t>
+      </w:r>
+      <w:r>
+        <w:t xml:space="preserve"> At the first use of each prepared file you say what it contains, why it is there, and that it is CC0 or public domain, without naming how it was made. Typed text is read back, and every table cell click is narrated.</w:t>
+      </w:r>
+    </w:p>
+    <w:p>
+      <w:pPr>
+        <w:pStyle w:val="ListParagraph"/>
+        <w:spacing w:after="100"/>
+        <w:ind w:left="432"/>
+      </w:pPr>
+      <w:r>
+        <w:t xml:space="preserve">6.  </w:t>
+      </w:r>
+      <w:r>
+        <w:rPr>
+          <w:b/>
+        </w:rPr>
+        <w:t>Epilogue.</w:t>
+      </w:r>
+      <w:r>
+        <w:t xml:space="preserve"> It now uses the six official topics. The target is 3 to 4 minutes and the maximum is 4:00. Three minutes is not a minimum, but all six topics must be covered.</w:t>
+      </w:r>
+    </w:p>
+    <w:p>
+      <w:pPr>
         <w:pStyle w:val="Heading3"/>
       </w:pPr>
       <w:r>
-        <w:t>The five rules while recording</w:t>
+        <w:t>The six rules while recording</w:t>
       </w:r>
     </w:p>
     <w:p>
@@ -363,7 +501,7 @@
         <w:t>Typing.</w:t>
       </w:r>
       <w:r>
-        <w:t xml:space="preserve"> Say what you will type and why, type in silence, then explain it with the pointer. Most bursts are under 10 characters. The longest are the two Word sentences, which should take under 30 seconds each.</w:t>
+        <w:t xml:space="preserve"> Say what you will type and why, type in silence, then read back what you typed with the pointer on it. Most bursts are under 10 characters. The longest are the two Word sentences, which should take under 30 seconds each.</w:t>
       </w:r>
     </w:p>
     <w:p>
@@ -374,6 +512,25 @@
       </w:pPr>
       <w:r>
         <w:t xml:space="preserve">5.  </w:t>
+      </w:r>
+      <w:r>
+        <w:rPr>
+          <w:b/>
+        </w:rPr>
+        <w:t>PII sweep.</w:t>
+      </w:r>
+      <w:r>
+        <w:t xml:space="preserve"> Every time an app comes forward, and every time a Save, Export or file window opens, glance at the top right corner of the app and at the window's sidebar for a name, photo or email. If anything shows, stop the recording, fix it, and start again.</w:t>
+      </w:r>
+    </w:p>
+    <w:p>
+      <w:pPr>
+        <w:pStyle w:val="ListParagraph"/>
+        <w:spacing w:after="100"/>
+        <w:ind w:left="432"/>
+      </w:pPr>
+      <w:r>
+        <w:t xml:space="preserve">6.  </w:t>
       </w:r>
       <w:r>
         <w:rPr>
@@ -570,7 +727,7 @@
               <w:rPr>
                 <w:sz w:val="19"/>
               </w:rPr>
-              <w:t>2:30</w:t>
+              <w:t>2:35</w:t>
             </w:r>
           </w:p>
         </w:tc>
@@ -584,7 +741,7 @@
               <w:rPr>
                 <w:sz w:val="19"/>
               </w:rPr>
-              <w:t>2:45</w:t>
+              <w:t>2:50</w:t>
             </w:r>
           </w:p>
         </w:tc>
@@ -598,7 +755,7 @@
               <w:rPr>
                 <w:sz w:val="19"/>
               </w:rPr>
-              <w:t>4:40</w:t>
+              <w:t>4:49</w:t>
             </w:r>
           </w:p>
         </w:tc>
@@ -642,7 +799,7 @@
               <w:rPr>
                 <w:sz w:val="19"/>
               </w:rPr>
-              <w:t>4:40</w:t>
+              <w:t>4:45</w:t>
             </w:r>
           </w:p>
         </w:tc>
@@ -656,7 +813,7 @@
               <w:rPr>
                 <w:sz w:val="19"/>
               </w:rPr>
-              <w:t>7:56</w:t>
+              <w:t>8:04</w:t>
             </w:r>
           </w:p>
         </w:tc>
@@ -700,7 +857,7 @@
               <w:rPr>
                 <w:sz w:val="19"/>
               </w:rPr>
-              <w:t>6:45</w:t>
+              <w:t>6:50</w:t>
             </w:r>
           </w:p>
         </w:tc>
@@ -714,7 +871,7 @@
               <w:rPr>
                 <w:sz w:val="19"/>
               </w:rPr>
-              <w:t>11:28</w:t>
+              <w:t>11:37</w:t>
             </w:r>
           </w:p>
         </w:tc>
@@ -758,7 +915,7 @@
               <w:rPr>
                 <w:sz w:val="19"/>
               </w:rPr>
-              <w:t>9:00</w:t>
+              <w:t>9:05</w:t>
             </w:r>
           </w:p>
         </w:tc>
@@ -772,7 +929,7 @@
               <w:rPr>
                 <w:sz w:val="19"/>
               </w:rPr>
-              <w:t>15:18</w:t>
+              <w:t>15:26</w:t>
             </w:r>
           </w:p>
         </w:tc>
@@ -802,7 +959,7 @@
               <w:rPr>
                 <w:sz w:val="19"/>
               </w:rPr>
-              <w:t>4:10</w:t>
+              <w:t>4:35</w:t>
             </w:r>
           </w:p>
         </w:tc>
@@ -816,7 +973,7 @@
               <w:rPr>
                 <w:sz w:val="19"/>
               </w:rPr>
-              <w:t>13:10</w:t>
+              <w:t>13:40</w:t>
             </w:r>
           </w:p>
         </w:tc>
@@ -830,7 +987,7 @@
               <w:rPr>
                 <w:sz w:val="19"/>
               </w:rPr>
-              <w:t>22:23</w:t>
+              <w:t>23:14</w:t>
             </w:r>
           </w:p>
         </w:tc>
@@ -860,7 +1017,7 @@
               <w:rPr>
                 <w:sz w:val="19"/>
               </w:rPr>
-              <w:t>3:20</w:t>
+              <w:t>3:25</w:t>
             </w:r>
           </w:p>
         </w:tc>
@@ -874,7 +1031,7 @@
               <w:rPr>
                 <w:sz w:val="19"/>
               </w:rPr>
-              <w:t>16:30</w:t>
+              <w:t>17:05</w:t>
             </w:r>
           </w:p>
         </w:tc>
@@ -888,7 +1045,7 @@
               <w:rPr>
                 <w:sz w:val="19"/>
               </w:rPr>
-              <w:t>28:03</w:t>
+              <w:t>29:02</w:t>
             </w:r>
           </w:p>
         </w:tc>
@@ -932,7 +1089,7 @@
               <w:rPr>
                 <w:sz w:val="19"/>
               </w:rPr>
-              <w:t>19:40</w:t>
+              <w:t>20:15</w:t>
             </w:r>
           </w:p>
         </w:tc>
@@ -946,7 +1103,7 @@
               <w:rPr>
                 <w:sz w:val="19"/>
               </w:rPr>
-              <w:t>33:26</w:t>
+              <w:t>34:25</w:t>
             </w:r>
           </w:p>
         </w:tc>
@@ -976,7 +1133,7 @@
               <w:rPr>
                 <w:sz w:val="19"/>
               </w:rPr>
-              <w:t>3:28</w:t>
+              <w:t>3:20</w:t>
             </w:r>
           </w:p>
         </w:tc>
@@ -1004,7 +1161,7 @@
               <w:rPr>
                 <w:sz w:val="19"/>
               </w:rPr>
-              <w:t>36:54 (finish)</w:t>
+              <w:t>37:45 (finish)</w:t>
             </w:r>
           </w:p>
         </w:tc>
@@ -1020,7 +1177,7 @@
         <w:spacing w:after="120"/>
       </w:pPr>
       <w:r>
-        <w:t>If you are more than 3 minutes behind a checkpoint, use the cut order in the last section right away. If you reach 35:00 and are not yet in Part 8, go straight to Part 8. The video must stay between 15:00 and 50:59, so a finish near 36:54 leaves about 14 minutes of safety.</w:t>
+        <w:t>If you are more than 3 minutes behind a checkpoint, use the cut order in the last section right away. If you reach 36:00 and are not yet in Part 8, go straight to Part 8. The video must stay between 15:00 and 50:59, so a finish near 37:45 leaves about 13 minutes of safety.</w:t>
       </w:r>
     </w:p>
     <w:p>
@@ -1036,7 +1193,7 @@
         <w:spacing w:after="120"/>
       </w:pPr>
       <w:r>
-        <w:t>Do all of this before pressing Start Recording. The guide forbids setting up an app after recording starts.</w:t>
+        <w:t>Do all of this before pressing Start Recording. The guide forbids launching or setting up an app after recording starts. Items 4 to 7 come from the new Technical Setup, Part A and Part B.</w:t>
       </w:r>
     </w:p>
     <w:p>
@@ -1055,7 +1212,7 @@
         <w:t>Studio first.</w:t>
       </w:r>
       <w:r>
-        <w:t xml:space="preserve"> The idea is already approved. The Goal you paste into TaskRecorder, the opening note and the Metadata.rtf Request must be the approved Goal, word for word. All input files must be made before recording starts, with no private data. Fill in Metadata.rtf before recording (a filled copy is in the pack, check it against Studio).</w:t>
+        <w:t xml:space="preserve"> Your approved idea moved the same Studio task to In Progress; continue in that task. The Goal you paste into TaskRecorder, the opening note and the Metadata.rtf Request must be the approved Goal, word for word. All input files must be made before recording starts, with no private data. Fill in Metadata.rtf before recording (TextEdit is allowed for this, and it must be closed before you start). A filled copy is in the pack: check it against Studio.</w:t>
       </w:r>
     </w:p>
     <w:p>
@@ -1109,10 +1266,10 @@
         <w:rPr>
           <w:b/>
         </w:rPr>
-        <w:t>Quit and tidy.</w:t>
-      </w:r>
-      <w:r>
-        <w:t xml:space="preserve"> Quit Grammarly and every background app except Insightful, Accessibility Inspector and TaskRecorder. In VS Code, turn GitHub Copilot and the chat panel off and make sure no personal account avatar shows. No AI feature may appear on screen.</w:t>
+        <w:t>Apps.</w:t>
+      </w:r>
+      <w:r>
+        <w:t xml:space="preserve"> Visual Studio Code, Microsoft Word and PowerPoint are not on the banned or limited-use lists in App_Policy.md; check the canonical list at odin-mercor1.vercel.app/validated-apps once more on recording day. Quit every other app with Command + Q (the red button only closes the window), then press Command + Tab: only the three task apps and TaskRecorder should appear. In VS Code, turn GitHub Copilot and the chat panel off. Insightful is only for hourly-paid work: if it applies to you, keep it running and minimized, and never show its window.</w:t>
       </w:r>
     </w:p>
     <w:p>
@@ -1128,10 +1285,10 @@
         <w:rPr>
           <w:b/>
         </w:rPr>
-        <w:t>Word and PowerPoint.</w:t>
-      </w:r>
-      <w:r>
-        <w:t xml:space="preserve"> Word signed in with the assigned account, no Copilot button on screen. Open two Word documents: opening_note.docx (it holds only the Goal) and input_3_memo_template.docx. In PowerPoint open input_4_briefing_template.pptx. Minimize every window except the opening note.</w:t>
+        <w:t>Accounts and corners.</w:t>
+      </w:r>
+      <w:r>
+        <w:t xml:space="preserve"> TaskRecorder 2.4.4 needs no sign-in, and assigned OTA accounts are retired. Sign in to Word and PowerPoint with your mercor.expert account or a new anonymised account with a neutral display name, or use your own licensed copy activated before recording with no name, email or licence detail visible. Then look at the top right corner of Word, PowerPoint and VS Code (also the Accounts icon at the bottom of VS Code's left bar): no name, photo or email may show, and no Copilot button. Check again in the dry run video.</w:t>
       </w:r>
     </w:p>
     <w:p>
@@ -1142,6 +1299,25 @@
       </w:pPr>
       <w:r>
         <w:t xml:space="preserve">6.  </w:t>
+      </w:r>
+      <w:r>
+        <w:rPr>
+          <w:b/>
+        </w:rPr>
+        <w:t>Names in Save and file windows.</w:t>
+      </w:r>
+      <w:r>
+        <w:t xml:space="preserve"> Your macOS username appears in Save, Export and Insert Picture windows, in the path and the sidebar. This task opens six of them: Save As in VS Code, Word and PowerPoint, Export in PowerPoint, and Insert Picture in Word and in PowerPoint. Rename your Mac to something neutral (System Settings, General, About, Name; then General, Sharing, Local hostname). In the dry run, look at every one of those windows. If your real name still shows, use the optional Recorder account (System Settings, Users and Groups, Add User, Administrator, name Recorder): put the TaskRecorder installer in /Users/Shared first, then repeat these setup items in that account.</w:t>
+      </w:r>
+    </w:p>
+    <w:p>
+      <w:pPr>
+        <w:pStyle w:val="ListParagraph"/>
+        <w:spacing w:after="100"/>
+        <w:ind w:left="432"/>
+      </w:pPr>
+      <w:r>
+        <w:t xml:space="preserve">7.  </w:t>
       </w:r>
       <w:r>
         <w:rPr>
@@ -1150,7 +1326,7 @@
         <w:t>Desktop.</w:t>
       </w:r>
       <w:r>
-        <w:t xml:space="preserve"> Dock on the left edge of the screen (if you use the right edge, say right), clock with seconds, unique wallpaper, mouse cursor size and colour left at default, Accessibility Inspector running with its window closed (dot under its Dock icon), Insightful minimized, notifications off, Finder closed. The Mac is plugged in with enough free storage. Zoom windows with the Window menu, never the green Full Screen button. Metadata.rtf stays closed. The Dock must be visible at the start and the end.</w:t>
+        <w:t xml:space="preserve"> Clear the Desktop: click it, press Command + A, Control-click the selection, choose New Folder with Selection, name it Desktop items, and drag it into Documents. Remove any widgets. Pick a built-in wallpaper (no personal photos). Turn on Do Not Disturb: System Settings, Focus, Do Not Disturb, set People and Apps to None, and turn Intelligent Breakthrough off. Put the Dock on the left edge (if you use the right edge, say right), with Automatically hide and show the Dock off and Show indicators for open applications on. The clock shows seconds. Change at least one UI element: wallpaper, light or dark mode, accent colour, Dock size, sidebar icon size, screen resolution or an in-app theme (Dock position does not count). Leave the cursor at its default size and colour. Accessibility Inspector runs with its window closed, with a dot under its Dock icon. Do not click the Downloads stack in the Dock. Close Finder windows. The Mac is plugged in with enough free storage. The Dock must be visible at the start and the end.</w:t>
       </w:r>
     </w:p>
     <w:p>
@@ -1160,7 +1336,26 @@
         <w:ind w:left="432"/>
       </w:pPr>
       <w:r>
-        <w:t xml:space="preserve">7.  </w:t>
+        <w:t xml:space="preserve">8.  </w:t>
+      </w:r>
+      <w:r>
+        <w:rPr>
+          <w:b/>
+        </w:rPr>
+        <w:t>Windows.</w:t>
+      </w:r>
+      <w:r>
+        <w:t xml:space="preserve"> In Word open two documents: opening_note.docx (it holds only the Goal, never the Approval ID) and input_3_memo_template.docx. In PowerPoint open input_4_briefing_template.pptx. Open VS Code on the study folder. Zoom windows with the Window menu, never the green Full Screen button. Minimize every window except the opening note. Studio, Slack, the guidelines and Metadata.rtf stay closed.</w:t>
+      </w:r>
+    </w:p>
+    <w:p>
+      <w:pPr>
+        <w:pStyle w:val="ListParagraph"/>
+        <w:spacing w:after="100"/>
+        <w:ind w:left="432"/>
+      </w:pPr>
+      <w:r>
+        <w:t xml:space="preserve">9.  </w:t>
       </w:r>
       <w:r>
         <w:rPr>
@@ -1169,7 +1364,7 @@
         <w:t>TaskRecorder.</w:t>
       </w:r>
       <w:r>
-        <w:t xml:space="preserve"> Signed in with the assigned account, three permissions green, microphone on. Paste the Goal into Task Description and check the whole text is visible by dragging the window larger. Used Apps exactly: Visual Studio Code, Microsoft Word, PowerPoint. Read this script from another device, never on the recorded screen.</w:t>
+        <w:t xml:space="preserve"> TaskRecorder 2.4.4 open, three permissions green, microphone on, the correct display selected. Clear anything left from your last task, paste the Goal into Task Description exactly, and enter Used Apps exactly: Visual Studio Code, Microsoft Word, PowerPoint. Drag the window larger until the whole description is visible. Read this script from another device, never on the recorded screen.</w:t>
       </w:r>
     </w:p>
     <w:p>
@@ -1179,7 +1374,7 @@
         <w:ind w:left="432"/>
       </w:pPr>
       <w:r>
-        <w:t xml:space="preserve">8.  </w:t>
+        <w:t xml:space="preserve">10.  </w:t>
       </w:r>
       <w:r>
         <w:rPr>
@@ -1198,16 +1393,16 @@
         <w:ind w:left="432"/>
       </w:pPr>
       <w:r>
-        <w:t xml:space="preserve">9.  </w:t>
+        <w:t xml:space="preserve">11.  </w:t>
       </w:r>
       <w:r>
         <w:rPr>
           <w:b/>
         </w:rPr>
-        <w:t>Dry run.</w:t>
-      </w:r>
-      <w:r>
-        <w:t xml:space="preserve"> In a temporary copy of the folder, do every step once: all the cells, the Word memo, the deck, Save As, the PDF export. Then delete the temporary folder and make sure the study folder is clean again. This warms up the kernel and the plotting cache and proves the environment works.</w:t>
+        <w:t>Test recording and dry run.</w:t>
+      </w:r>
+      <w:r>
+        <w:t xml:space="preserve"> First record 10 seconds: switch between two apps, open a Save window, stop, and watch it back for your name, email, personal file names or notifications. Fix anything you see. Then, in a temporary copy of the folder, do every step once: all the cells, the Word memo, the deck, Save As, the PDF export. Delete the temporary folder and make sure the study folder is clean again. This warms up the kernel and the plotting cache and proves the environment works.</w:t>
       </w:r>
     </w:p>
     <w:p>
@@ -1217,7 +1412,7 @@
         <w:ind w:left="432"/>
       </w:pPr>
       <w:r>
-        <w:t xml:space="preserve">10.  </w:t>
+        <w:t xml:space="preserve">12.  </w:t>
       </w:r>
       <w:r>
         <w:rPr>
@@ -1226,7 +1421,7 @@
         <w:t>Epilogue rehearsal.</w:t>
       </w:r>
       <w:r>
-        <w:t xml:space="preserve"> Read the epilogue aloud once with a timer. It must take between 3:00 and 4:00. If you are under 3:00, slow down. If you are over 3:50, drop one sentence from Approach or Reflection.</w:t>
+        <w:t xml:space="preserve"> Read the epilogue aloud once with a timer. The target is 3 to 4 minutes and the maximum is 4:00. Three minutes is not a minimum, but cover all six topics. If you are over 3:50, drop one sentence from Approach or Reflection.</w:t>
       </w:r>
     </w:p>
     <w:p>
@@ -1308,7 +1503,7 @@
                 <w:b/>
                 <w:sz w:val="19"/>
               </w:rPr>
-              <w:t>Typing share at 37 minutes</w:t>
+              <w:t>Typing share at 38 minutes</w:t>
             </w:r>
           </w:p>
         </w:tc>
@@ -1486,7 +1681,7 @@
               <w:rPr>
                 <w:sz w:val="19"/>
               </w:rPr>
-              <w:t>11 %</w:t>
+              <w:t>10 %</w:t>
             </w:r>
           </w:p>
         </w:tc>
@@ -1602,7 +1797,7 @@
               <w:rPr>
                 <w:sz w:val="19"/>
               </w:rPr>
-              <w:t>18 %</w:t>
+              <w:t>17 %</w:t>
             </w:r>
           </w:p>
         </w:tc>
@@ -1632,7 +1827,7 @@
         <w:spacing w:after="120"/>
       </w:pPr>
       <w:r>
-        <w:t>These shares are estimates: 524 characters times your seconds per character, divided by the video length of about 37 minutes. I do not know exactly how AutoQC counts typing, so the test decides, not my table. The limit is strictly below 20 percent for this engineering task, and the AutoQC list says up to about 30 percent only for coding tasks.</w:t>
+        <w:t>These shares are estimates: 524 characters times your seconds per character, divided by the video length of about 38 minutes. I do not know exactly how AutoQC counts typing, so the test decides, not my table. The limit is strictly below 20 percent for this engineering task, and the AutoQC list says up to about 30 percent only for coding tasks.</w:t>
       </w:r>
     </w:p>
     <w:p>
@@ -1724,7 +1919,7 @@
         <w:pStyle w:val="Heading2"/>
       </w:pPr>
       <w:r>
-        <w:t>Part 2: VS Code setup (0:15 to 2:45)</w:t>
+        <w:t>Part 2: VS Code setup (0:15 to 2:50)</w:t>
       </w:r>
     </w:p>
     <w:p>
@@ -1802,6 +1997,17 @@
     </w:p>
     <w:p>
       <w:pPr>
+        <w:spacing w:after="120"/>
+      </w:pPr>
+      <w:r>
+        <w:rPr>
+          <w:i/>
+        </w:rPr>
+        <w:t>Keep every Save, Export and file window brief. Do not hover over the sidebar or the path bar, and do not scroll through folders. These windows can show your macOS username, and a real name on screen is a send-back (see Before you press record, item 6).</w:t>
+      </w:r>
+    </w:p>
+    <w:p>
+      <w:pPr>
         <w:pStyle w:val="Code"/>
         <w:spacing w:after="60"/>
         <w:ind w:left="432"/>
@@ -1845,7 +2051,7 @@
         <w:rPr>
           <w:b/>
         </w:rPr>
-        <w:t>2.2 Read the setup cell (1 minute 15 seconds)</w:t>
+        <w:t>2.2 Read the setup cell (1 minute 20 seconds)</w:t>
       </w:r>
     </w:p>
     <w:p>
@@ -1915,7 +2121,7 @@
         <w:t xml:space="preserve">SAY: </w:t>
       </w:r>
       <w:r>
-        <w:t>"I'm pointing at duty_kW, which gives heat duty in kilowatts from flow, specific heat and temperature change. Now lmtd_counter, the log-mean temperature difference for counter-current flow. Now overall_U, duty divided by area times that difference, with an area of 42 square metres. The starter notebook is a prepared input file, free of royalties and copyright. The decisions are mine, and I will type them."</w:t>
+        <w:t>"I'm pointing at duty_kW, which gives heat duty in kilowatts from flow, specific heat and temperature change. Now lmtd_counter, the log-mean temperature difference for counter-current flow. Now overall_U, duty divided by area times that difference, with an area of 42 square metres. The starter notebook is a prepared input file holding these helper functions, CC0 and free of copyright. The decisions are mine, and I will type them."</w:t>
       </w:r>
     </w:p>
     <w:p>
@@ -1955,7 +2161,7 @@
         <w:t xml:space="preserve">SAY: </w:t>
       </w:r>
       <w:r>
-        <w:t>"I'm clicking input_1_exchanger_data.csv in the Explorer sidebar on the left side of the window. It is a synthetic dataset prepared for this exercise, free of royalties and copyright. In the first row I'm pointing at the headers: timestamp, then hot flow, specific heat, in and out temperatures, and the same for the cold stream. Each row is one hourly reading, 30 days in all. Now I'm clicking the final_output_1 tab to return to the notebook."</w:t>
+        <w:t>"I'm clicking input_1_exchanger_data.csv in the Explorer sidebar on the left side of the window. It is a synthetic dataset prepared for this exercise, CC0 and free of copyright, holding 30 days of hourly readings from one heat exchanger. In the first row I'm pointing at the headers: timestamp, then hot flow, specific heat, in and out temperatures, and the same for the cold stream. Now I'm clicking the final_output_1 tab to return to the notebook."</w:t>
       </w:r>
     </w:p>
     <w:p>
@@ -1963,7 +2169,7 @@
         <w:pStyle w:val="Heading2"/>
       </w:pPr>
       <w:r>
-        <w:t>Part 3: Load and clean the data (2:45 to 4:40)</w:t>
+        <w:t>Part 3: Load and clean the data (2:50 to 4:45)</w:t>
       </w:r>
     </w:p>
     <w:p>
@@ -2152,7 +2358,7 @@
         <w:pStyle w:val="Heading2"/>
       </w:pPr>
       <w:r>
-        <w:t>Part 4: Duty, temperature difference, U and the energy balance (4:40 to 6:45)</w:t>
+        <w:t>Part 4: Duty, temperature difference, U and the energy balance (4:45 to 6:50)</w:t>
       </w:r>
     </w:p>
     <w:p>
@@ -2343,7 +2549,7 @@
         <w:pStyle w:val="Heading2"/>
       </w:pPr>
       <w:r>
-        <w:t>Part 5: Fouling limit, trend and chart (6:45 to 9:00)</w:t>
+        <w:t>Part 5: Fouling limit, trend and chart (6:50 to 9:05)</w:t>
       </w:r>
     </w:p>
     <w:p>
@@ -2573,7 +2779,7 @@
         <w:pStyle w:val="Heading2"/>
       </w:pPr>
       <w:r>
-        <w:t>Part 6: Maintenance memo in Word (9:00 to 13:10)</w:t>
+        <w:t>Part 6: Maintenance memo in Word (9:05 to 13:40)</w:t>
       </w:r>
     </w:p>
     <w:p>
@@ -2581,7 +2787,7 @@
         <w:spacing w:after="120"/>
       </w:pPr>
       <w:r>
-        <w:t>The header block and four headings are already in the template. You type one sentence, five short values and one sentence. The picture goes in with the mouse.</w:t>
+        <w:t>The header block and four headings are already in the template. You type one sentence, five short values and one sentence. The picture goes in with the mouse. The Save and file windows can show your macOS username, so keep them brief.</w:t>
       </w:r>
     </w:p>
     <w:p>
@@ -2621,7 +2827,7 @@
         <w:t xml:space="preserve">SAY, before typing: </w:t>
       </w:r>
       <w:r>
-        <w:t>"I'm right-clicking the Word icon in the Dock along the left edge of the screen. In the list that opens to its right, I'm clicking input_3_memo_template.docx, a prepared input file, free of royalties and copyright. Now I'm clicking File in the menu bar, then Save As. I will type final output three as the name, because the template must stay untouched, and click Save at the bottom right."</w:t>
+        <w:t>"I'm right-clicking the Word icon in the Dock along the left edge of the screen. In the list that opens to its right, I'm clicking input_3_memo_template.docx, the memo template, a prepared input file that is CC0 and free of copyright. Now I'm clicking File in the menu bar, then Save As. I will type final output three as the name, because the template must stay untouched, and click Save at the bottom right."</w:t>
       </w:r>
     </w:p>
     <w:p>
@@ -2658,7 +2864,7 @@
         <w:rPr>
           <w:b/>
         </w:rPr>
-        <w:t>6.2 Summary sentence and key values (1 minute 35 seconds)</w:t>
+        <w:t>6.2 Summary sentence and key values (1 minute 55 seconds)</w:t>
       </w:r>
     </w:p>
     <w:p>
@@ -2725,7 +2931,7 @@
         <w:t xml:space="preserve">SAY: </w:t>
       </w:r>
       <w:r>
-        <w:t>"The sentence gives how far fouling has gone and the date the limit will be crossed."</w:t>
+        <w:t>"The sentence reads: E-101 is 13.7 percent below clean, and the 20 percent limit will be crossed on Monday 12 October 2026."</w:t>
       </w:r>
     </w:p>
     <w:p>
@@ -2753,7 +2959,7 @@
         <w:t xml:space="preserve">SAY, before typing: </w:t>
       </w:r>
       <w:r>
-        <w:t>"Under heading 2, Key values, I'm clicking the right-hand cell beside Clean coefficient. I will fill the five cells from the notebook output, top to bottom."</w:t>
+        <w:t>"Under heading 2, Key values, I'm clicking the right-hand cell beside Clean coefficient and typing 496.1 watts per square metre kelvin. Next I'm clicking the cell beside Current coefficient and typing 428.0. Then the cell beside Fouling limit for 396.9, the cell beside Predicted day the limit is crossed for day 41.9, and the cell beside Predicted crossing date for Monday 12 October."</w:t>
       </w:r>
     </w:p>
     <w:p>
@@ -2902,7 +3108,7 @@
         <w:rPr>
           <w:b/>
         </w:rPr>
-        <w:t>6.4 Recommendation, review and save (1 minute 15 seconds)</w:t>
+        <w:t>6.4 Recommendation, review and save (1 minute 20 seconds)</w:t>
       </w:r>
     </w:p>
     <w:p>
@@ -2969,7 +3175,7 @@
         <w:t xml:space="preserve">SAY: </w:t>
       </w:r>
       <w:r>
-        <w:t>"Friday 9 October, three days before Monday 12 October."</w:t>
+        <w:t>"The sentence reads: clean E-101 at the next planned shutdown, no later than Friday 9 October 2026. That is three days before Monday 12 October."</w:t>
       </w:r>
     </w:p>
     <w:p>
@@ -3005,7 +3211,7 @@
         <w:pStyle w:val="Heading2"/>
       </w:pPr>
       <w:r>
-        <w:t>Part 7: Two-slide briefing in PowerPoint (13:10 to 16:30)</w:t>
+        <w:t>Part 7: Two-slide briefing in PowerPoint (13:40 to 17:05)</w:t>
       </w:r>
     </w:p>
     <w:p>
@@ -3013,7 +3219,7 @@
         <w:spacing w:after="120"/>
       </w:pPr>
       <w:r>
-        <w:t>Two blank slides. You type one title, then a second title and two short bullets, insert one picture with the mouse, and export the PDF.</w:t>
+        <w:t>Two blank slides. You type one title, then a second title and two short bullets, insert one picture with the mouse, and export the PDF. The PowerPoint account area (top right) can show a name or photo: check it in the dry run.</w:t>
       </w:r>
     </w:p>
     <w:p>
@@ -3053,7 +3259,7 @@
         <w:t xml:space="preserve">SAY, before typing: </w:t>
       </w:r>
       <w:r>
-        <w:t>"I'm right-clicking the PowerPoint icon in the Dock along the left edge of the screen and choosing input_4_briefing_template.pptx, a prepared input file, free of royalties and copyright. Now File in the menu bar, then Save As. I will type final output four as the name, and click Save at the bottom right."</w:t>
+        <w:t>"I'm right-clicking the PowerPoint icon in the Dock along the left edge of the screen and choosing input_4_briefing_template.pptx, the deck template with two blank slides, a prepared input file that is CC0 and free of copyright. Now File in the menu bar, then Save As. I will type final output four as the name, and click Save at the bottom right."</w:t>
       </w:r>
     </w:p>
     <w:p>
@@ -3183,7 +3389,7 @@
         <w:rPr>
           <w:b/>
         </w:rPr>
-        <w:t>7.3 Slide 2, the recommendation and the risk (1 minute 10 seconds)</w:t>
+        <w:t>7.3 Slide 2, the recommendation and the risk (1 minute 15 seconds)</w:t>
       </w:r>
     </w:p>
     <w:p>
@@ -3250,7 +3456,7 @@
         <w:t xml:space="preserve">SAY, before typing: </w:t>
       </w:r>
       <w:r>
-        <w:t>"Now I'm clicking the large text box under the title. I will type two bullets, the action and the risk, because the supervisor needs to know how far to trust the date."</w:t>
+        <w:t>"The title reads: Clean E-101 by Friday 9 October. Now I'm clicking the large text box under the title. I will type two bullets, the action and the risk, because the supervisor needs to know how far to trust the date."</w:t>
       </w:r>
     </w:p>
     <w:p>
@@ -3314,7 +3520,7 @@
         <w:t xml:space="preserve">SAY: </w:t>
       </w:r>
       <w:r>
-        <w:t>"The first bullet is the action. The second is the risk: fouling rarely follows a straight line exactly, so I recommend rechecking weekly."</w:t>
+        <w:t>"The first bullet reads: clean at the next planned shutdown. The second reads: risk, trend is an estimate, recheck weekly, because fouling rarely follows a straight line exactly."</w:t>
       </w:r>
     </w:p>
     <w:p>
@@ -3415,7 +3621,7 @@
         <w:pStyle w:val="Heading2"/>
       </w:pPr>
       <w:r>
-        <w:t>Part 8: Verify, cross-check and close (16:30 to 19:40)</w:t>
+        <w:t>Part 8: Verify, cross-check and close (17:05 to 20:15)</w:t>
       </w:r>
     </w:p>
     <w:p>
@@ -3766,6 +3972,17 @@
       </w:pPr>
       <w:r>
         <w:rPr>
+          <w:i/>
+        </w:rPr>
+        <w:t>Before the epilogue starts, look at the top right corner of the PowerPoint window. If a name or photo shows there, the account setup in Before you press record, item 5 was not finished: stop and fix it before recording, not during.</w:t>
+      </w:r>
+    </w:p>
+    <w:p>
+      <w:pPr>
+        <w:spacing w:after="120"/>
+      </w:pPr>
+      <w:r>
+        <w:rPr>
           <w:b/>
         </w:rPr>
         <w:t xml:space="preserve">SAY: </w:t>
@@ -3816,7 +4033,7 @@
         <w:pStyle w:val="Heading2"/>
       </w:pPr>
       <w:r>
-        <w:t>Part 9: Epilogue (about 3:28, maximum 4:00)</w:t>
+        <w:t>Part 9: Epilogue (about 3:20, maximum 4:00)</w:t>
       </w:r>
     </w:p>
     <w:p>
@@ -3824,7 +4041,7 @@
         <w:spacing w:after="120"/>
       </w:pPr>
       <w:r>
-        <w:t>Start immediately after the closing line, with all outputs saved and PowerPoint still on screen. Your mouse can stay still. Do not bring TaskRecorder back until the last word. Target 3:30, never over 4:00. Speak calmly, about 120 to 130 words a minute. Say each topic word first so the reviewer hears the structure.</w:t>
+        <w:t>Start immediately after the closing line, with all outputs saved and PowerPoint still on screen. Your mouse can stay still. Do not bring TaskRecorder back until the last word. The target is 3 to 4 minutes and the maximum is 4:00. Three minutes is not a minimum, but cover all six topics. Speak calmly, about 120 to 130 words a minute, and say each topic name first so the structure is easy to hear.</w:t>
       </w:r>
     </w:p>
     <w:p>
@@ -3838,7 +4055,7 @@
         <w:t xml:space="preserve">SAY, completion and outcome: </w:t>
       </w:r>
       <w:r>
-        <w:t>"First, completion and outcome. I verified the result in three ways. The energy balance check showed every kept reading agreeing within 3 percent. I recalculated one reading by hand and matched the notebook's duty and temperature difference exactly, with U within a tenth of a percent. And I confirmed the same numbers appear in the notebook, the memo and the deck. The outcome is that E-101 is 13.7 percent below its clean coefficient today, and the straight-line trend reaches the 20 percent limit on Monday 12 October, so I recommended cleaning by Friday 9 October. The main limitation is that the prediction extends 30 days of data about 12 days forward with a straight line, so the date is an estimate, not a guarantee."</w:t>
+        <w:t>"First, completion and outcome. I verified the result in three ways. The energy balance check showed every kept reading agreeing within 3 percent. I recalculated one reading by hand and matched the notebook's duty and temperature difference exactly, with U within a tenth of a percent. And I confirmed the same numbers appear in the notebook, the memo and the deck. E-101 is 13.7 percent below its clean coefficient today, and the straight-line trend reaches the 20 percent limit on Monday 12 October, so I recommended cleaning by Friday 9 October. The main limitation is that the prediction extends 30 days of data about 12 days forward with a straight line, so the date is an estimate, not a guarantee."</w:t>
       </w:r>
     </w:p>
     <w:p>
@@ -3849,10 +4066,10 @@
         <w:rPr>
           <w:b/>
         </w:rPr>
-        <w:t xml:space="preserve">SAY, approach: </w:t>
-      </w:r>
-      <w:r>
-        <w:t>"Second, my approach. I cleaned the data first, because shutdown hours and faulty sensor readings would corrupt everything after them. I checked the energy balance before trusting U, since U depends on the duty, and then compared a simple trend with a rule-of-thumb limit. A simple trend like that is easy for a maintenance supervisor to follow and challenge."</w:t>
+        <w:t xml:space="preserve">SAY, approach and key decision: </w:t>
+      </w:r>
+      <w:r>
+        <w:t>"Second, approach and key decision. I cleaned the data first, because shutdown hours and faulty sensor readings would corrupt everything after them. I checked the energy balance before trusting U, since U depends on the duty, and then compared a simple trend with a rule-of-thumb limit. The key decision was to exclude the 4 mismatched readings instead of keeping them, because a drifting sensor can bias U by several percent."</w:t>
       </w:r>
     </w:p>
     <w:p>
@@ -3863,10 +4080,10 @@
         <w:rPr>
           <w:b/>
         </w:rPr>
-        <w:t xml:space="preserve">SAY, challenges: </w:t>
-      </w:r>
-      <w:r>
-        <w:t>"Third, challenges. The hardest part was deciding what to exclude. Removing the 6 shutdown hours was clear-cut. The 4 readings with 6 to 8 percent imbalance needed judgment. I excluded them because a drifting sensor can bias U by several percent, and I reported them rather than deleting them silently. I also kept every threshold as a visible value in its cell, so a reviewer can see my decisions and change them."</w:t>
+        <w:t xml:space="preserve">SAY, challenges and problem solving: </w:t>
+      </w:r>
+      <w:r>
+        <w:t>"Third, challenges and problem solving. The hardest part was deciding what to exclude. Removing the 6 shutdown hours was clear-cut, but the 4 readings with 6 to 8 percent imbalance needed judgment. I resolved it by reporting them in a table rather than deleting them silently, and by keeping every threshold as a visible value in its cell."</w:t>
       </w:r>
     </w:p>
     <w:p>
@@ -3877,10 +4094,10 @@
         <w:rPr>
           <w:b/>
         </w:rPr>
-        <w:t xml:space="preserve">SAY, quality: </w:t>
-      </w:r>
-      <w:r>
-        <w:t>"Fourth, quality. The result is good enough for planning. The scatter around the trend line is only about 2 watts per square metre kelvin, small next to the roughly 100-unit drop from clean to the limit. The weaknesses are that fouling is rarely perfectly linear, the model ignores changes in flow and fluid properties, and the 3-day margin is a judgment, not a calculated bound."</w:t>
+        <w:t xml:space="preserve">SAY, quality assessment: </w:t>
+      </w:r>
+      <w:r>
+        <w:t>"Fourth, quality assessment. The result is good enough for planning. The scatter around the trend line is only about 2 watts per square metre kelvin, small next to the roughly 100-unit drop from clean to the limit. The weaknesses are that fouling is rarely perfectly linear, the model ignores changes in flow and fluid properties, and the 3-day margin is a judgment, not a calculated bound."</w:t>
       </w:r>
     </w:p>
     <w:p>
@@ -3891,10 +4108,10 @@
         <w:rPr>
           <w:b/>
         </w:rPr>
-        <w:t xml:space="preserve">SAY, reflection: </w:t>
-      </w:r>
-      <w:r>
-        <w:t>"Fifth, reflection. With more time I would fit the fouling resistance instead of U, because it is the physically meaningful quantity. I would give the crossing date as a range using confidence intervals, and I would automate the weekly recheck I recommended."</w:t>
+        <w:t xml:space="preserve">SAY, reflection and improvement: </w:t>
+      </w:r>
+      <w:r>
+        <w:t>"Fifth, reflection and improvement. With more time I would fit the fouling resistance instead of U, because it is the physically meaningful quantity. I would give the crossing date as a range using confidence intervals, and I would automate the weekly recheck I recommended."</w:t>
       </w:r>
     </w:p>
     <w:p>
@@ -3908,7 +4125,7 @@
         <w:t xml:space="preserve">SAY, insight: </w:t>
       </w:r>
       <w:r>
-        <w:t>"Last, one insight. A less experienced engineer might overlook that the log-mean temperature difference is undefined when the two end differences are equal, and that near-zero flow hours silently produce nonsense coefficients that can drag a trend line toward an early cleaning. Both are easy to miss unless you look at the raw data first."</w:t>
+        <w:t>"Last, one insight. A less experienced engineer might overlook that the log-mean temperature difference is undefined when the two end differences are equal, and that near-zero flow hours silently produce nonsense coefficients that can drag a trend line toward an early cleaning."</w:t>
       </w:r>
     </w:p>
     <w:p>
@@ -3916,7 +4133,7 @@
         <w:spacing w:after="120"/>
       </w:pPr>
       <w:r>
-        <w:t>The epilogue is 417 words, which is about 3:12 at 130 words a minute and 3:47 at 110. Both are inside the 3:00 to 4:00 window.</w:t>
+        <w:t>The epilogue is 400 words, which is about 3:04 at 130 words a minute and 3:38 at 110. Both are inside the 4:00 maximum, and above 3:00 at a normal pace.</w:t>
       </w:r>
     </w:p>
     <w:p>
@@ -4343,10 +4560,10 @@
         <w:rPr>
           <w:b/>
         </w:rPr>
-        <w:t>Check the video length.</w:t>
-      </w:r>
-      <w:r>
-        <w:t xml:space="preserve"> It must be between 15:00 and 50:59 including the epilogue. Open video.mp4 in QuickTime and check the beginning, middle and end, then scrub it in 10 minute chunks and look for three things: a stretch over 45 seconds with no pointer movement (typing does not count), a typing burst over 30 seconds, and a stretch where your voice is unclear or silent. Confirm the epilogue is there and lasts 3:00 to 4:00. Tell me any timestamp before you upload.</w:t>
+        <w:t>Check the video.</w:t>
+      </w:r>
+      <w:r>
+        <w:t xml:space="preserve"> Length must be 15:00 to 50:59 including the epilogue (reviewers may accept up to 54:59, but plan for 50:59). Open video.mp4 in QuickTime and check the beginning, middle and end, then scrub it in 10 minute chunks and look for: a stretch over 45 seconds with no pointer movement outside the epilogue (typing does not count), a typing burst over 30 seconds, and a stretch where your voice is unclear or silent. Then do a PII sweep: at the start, at every app switch, at every Save, Export and file window, and in the last minutes, look at the top right corner of each app and the sidebar of each window for a name, photo or email. Confirm the epilogue is there and is no longer than 4:00. Tell me any timestamp before you upload.</w:t>
       </w:r>
     </w:p>
     <w:p>
@@ -4362,10 +4579,10 @@
         <w:rPr>
           <w:b/>
         </w:rPr>
-        <w:t>Check the screenshots.</w:t>
-      </w:r>
-      <w:r>
-        <w:t xml:space="preserve"> Count the PNG files and divide by the video length in seconds. It must be above 0.5. The folder must hold the PNGs and the .jsonl files from the same attempt.</w:t>
+        <w:t>Check the screenshots and the archive.</w:t>
+      </w:r>
+      <w:r>
+        <w:t xml:space="preserve"> Count the PNG files and divide by the video length in seconds. It must be above 0.5. The archive must hold the screenshots folder, video.mp4, frames.jsonl, ax.jsonl, input.jsonl, processes.jsonl and recording.log, all from the same attempt.</w:t>
       </w:r>
     </w:p>
     <w:p>
@@ -4384,7 +4601,7 @@
         <w:t>Build Deliverables.zip:</w:t>
       </w:r>
       <w:r>
-        <w:t xml:space="preserve"> one folder named Deliverables, flat inside, with 9 files. In the Terminal, after recording only, run cd Deliverables and then: for f in *_*; do mv "$f" "${f//_/ }"; done. The names become: input 1.csv, input 2.ipynb, input 3.docx, input 4.pptx, final output 1.ipynb, final output 2.png, final output 3.docx, final output 4.pptx, final output 5.pdf. Input 2 must be the untouched starter. There are no intermediate artifacts in this workflow. No .DS_Store, no ~$ files, no __MACOSX, no .vscode. Then from the folder that holds Deliverables run: zip -r -X "Deliverables.zip" Deliverables -x "*.DS_Store" and check with unzip -l "Deliverables.zip". Do not use Finder's Compress. Send me the zip and I will check it before you upload. The pack also contains a Deliverables inputs-only zip with inputs 1 to 4 already named.</w:t>
+        <w:t xml:space="preserve"> one folder named Deliverables, flat inside, with 9 files. In the Terminal, after recording only (Terminal is allowed, and nothing here is recorded), run cd Deliverables and then: for f in *_*; do mv "$f" "${f//_/ }"; done. The names become: input 1.csv, input 2.ipynb, input 3.docx, input 4.pptx, final output 1.ipynb, final output 2.png, final output 3.docx, final output 4.pptx, final output 5.pdf. Input 2 must be the untouched starter. There are no intermediate artifacts in this workflow. No .DS_Store, no ~$ files, no __MACOSX, no .vscode. Then from the folder that holds Deliverables run: zip -r -X "Deliverables.zip" Deliverables -x "*.DS_Store" and check with unzip -l "Deliverables.zip". Do not use Finder's Compress. Send me the zip and I will check it before you upload. The pack also contains a Deliverables inputs-only zip with inputs 1 to 4 already named.</w:t>
       </w:r>
     </w:p>
     <w:p>
@@ -4403,7 +4620,7 @@
         <w:t>Metadata.rtf</w:t>
       </w:r>
       <w:r>
-        <w:t xml:space="preserve"> goes in separately, not inside the zip. Topology, in order: Visual Studio Code CREATE, Microsoft Word CREATE, PowerPoint CREATE, Visual Studio Code MODIFY, Microsoft Word LOOKUP, PowerPoint LOOKUP. Request must equal the Goal exactly. Task Description is a numbered outline of those visits. Compare it with the video and add any extra app visit you made.</w:t>
+        <w:t xml:space="preserve"> goes in separately, not inside the zip. Topology, in order: Visual Studio Code CREATE, Microsoft Word CREATE, PowerPoint CREATE, Visual Studio Code MODIFY, Microsoft Word LOOKUP, PowerPoint LOOKUP. Request must equal the Goal exactly. Task Description is a numbered outline of those visits. Compare it with the video and add any extra app visit you made. Reviewers can correct metadata themselves, but get it right first.</w:t>
       </w:r>
     </w:p>
     <w:p>
@@ -4422,7 +4639,7 @@
         <w:t>Studio:</w:t>
       </w:r>
       <w:r>
-        <w:t xml:space="preserve"> upload the four files: Metadata.rtf, video.mp4 exactly as TaskRecorder made it, the recording_TIMESTAMP.zip, and Deliverables.zip. Fill resolution, light or dark mode, Dock position, wallpaper changed, and the Mac spec. Final Notes: see the next section. Run both AutoQC checks, the files and recording check first and the narration check about 10 minutes later, and resolve every blocking finding. If AutoQC flags something, open your video at the flagged timestamps first, and dispute only if the video clearly contradicts the finding.</w:t>
+        <w:t xml:space="preserve"> upload the four files: Metadata.rtf, video.mp4 exactly as TaskRecorder made it, the recording_TIMESTAMP.zip, and Deliverables.zip. Fill resolution, light or dark mode, Dock position, wallpaper changed, and the Mac spec. Run both AutoQC checks, the files and recording check first and the narration check about 10 minutes later. Only Major flags block submission: fix or dispute each one. Minor flags are advice: fix them if it is quick, otherwise apply them next time. If a flag is wrong, dispute it with a written reason and a timestamp. If a flag is right and it is a file or metadata problem, upload the corrected file and re-run AutoQC; re-record only for a genuine recording problem, and never edit the video.</w:t>
       </w:r>
     </w:p>
     <w:p>
@@ -4438,10 +4655,10 @@
         <w:rPr>
           <w:b/>
         </w:rPr>
-        <w:t>Manual checks and Workflow Checklist.</w:t>
-      </w:r>
-      <w:r>
-        <w:t xml:space="preserve"> Before you submit, go through the Workflow Checklist in the Writer Guidelines line by line: Before Recording (Task Plan), Before Recording (Prepare), During Recording and After Recording. Tick each manual check only after checking it against the recording, tick the epilogue box, confirm the checklist and PII boxes, and tick the final confirmation last.</w:t>
+        <w:t>Manual checks, Workflow Checklist and submit.</w:t>
+      </w:r>
+      <w:r>
+        <w:t xml:space="preserve"> Before you submit, go through the Workflow Checklist in the Writer Guidelines line by line: Before Recording (Task Plan), Before Recording (Prepare), During Recording and After Recording. Tick each manual check only after checking it against the recording. Tick the epilogue checkbox because your recording includes the epilogue. Confirm the checklist and PII boxes, and tick the final confirmation last, after every Major flag is fixed or disputed. After Submit for Review, the status should read Ready for Review. If submission stays blocked, send the task link and the exact error to #odin--helpdesk.</w:t>
       </w:r>
     </w:p>
     <w:p>
@@ -4463,7 +4680,7 @@
         <w:t xml:space="preserve">1. Where the input files came from. </w:t>
       </w:r>
       <w:r>
-        <w:t>The guide says inputs prepared with AI must come from Gemini only, prepared before recording, and described in Final Notes as exactly: AI-generated before recording. The input files in this pack (the CSV, the starter notebook and the two templates) were written with a different assistant, not Gemini. Do not tick Gemini or AI-generated file for them on the strength of this pack. Either regenerate the CSV and the starter notebook with Gemini and re-read every number from your own output, or ask Loki whether files prepared another way are acceptable for this approved idea, and follow the answer exactly. If you regenerate, the numbers in this script change, and Part 4 to 8 must be re-read from your screen.</w:t>
+        <w:t>The guide says inputs prepared with AI must come from Gemini only, prepared before recording, and described in Final Notes as exactly: AI-generated before recording. A Gemini watermark on a prepared input is allowed, and no other watermark is. The input files in this pack (the CSV, the starter notebook and the two templates) were written with a different assistant, not Gemini. Do not select AI-generated file in Studio for them on the strength of this pack. Either regenerate the CSV and the starter notebook with Gemini and re-read every number from your own output, or ask Loki in #odin--helpdesk whether files prepared another way are acceptable for this approved idea, and follow the answer exactly. If you regenerate, the numbers in this script change, and Parts 4 to 8 must be re-read from your screen.</w:t>
       </w:r>
     </w:p>
     <w:p>
@@ -4477,7 +4694,7 @@
         <w:t xml:space="preserve">2. The typing limit. </w:t>
       </w:r>
       <w:r>
-        <w:t>Ask Loki whether this counts as a coding task for the 30 percent typing limit. Plan for below 20 percent, which the typing counter above already meets for any speed up to 0.60 seconds per character.</w:t>
+        <w:t>Writers plan for below 20 percent typing, or 30 percent for coding and content and writing tasks. Reviewers fail only above 25 percent, or 35 percent for those tasks, so plan to the writer limit. Ask Loki whether this counts as a coding task. Either way, the typing counter above already meets 20 percent for any speed up to 0.60 seconds per character.</w:t>
       </w:r>
     </w:p>
     <w:p>
@@ -4757,6 +4974,96 @@
               <w:rPr>
                 <w:sz w:val="19"/>
               </w:rPr>
+              <w:t>A window covers more than about 25 percent of another for more than 6 seconds</w:t>
+            </w:r>
+          </w:p>
+        </w:tc>
+        <w:tc>
+          <w:tcPr>
+            <w:tcW w:type="dxa" w:w="5616"/>
+          </w:tcPr>
+          <w:p>
+            <w:r/>
+            <w:r>
+              <w:rPr>
+                <w:sz w:val="19"/>
+              </w:rPr>
+              <w:t>Minimize or move it right away, say what you are doing, and carry on.</w:t>
+            </w:r>
+          </w:p>
+        </w:tc>
+      </w:tr>
+      <w:tr>
+        <w:tc>
+          <w:tcPr>
+            <w:tcW w:type="dxa" w:w="3744"/>
+          </w:tcPr>
+          <w:p>
+            <w:r/>
+            <w:r>
+              <w:rPr>
+                <w:sz w:val="19"/>
+              </w:rPr>
+              <w:t>A name, photo or email shows in a corner, a Save window or the sidebar</w:t>
+            </w:r>
+          </w:p>
+        </w:tc>
+        <w:tc>
+          <w:tcPr>
+            <w:tcW w:type="dxa" w:w="5616"/>
+          </w:tcPr>
+          <w:p>
+            <w:r/>
+            <w:r>
+              <w:rPr>
+                <w:sz w:val="19"/>
+              </w:rPr>
+              <w:t>Stop the recording. Fix the account or the Mac name, then record again from the start.</w:t>
+            </w:r>
+          </w:p>
+        </w:tc>
+      </w:tr>
+      <w:tr>
+        <w:tc>
+          <w:tcPr>
+            <w:tcW w:type="dxa" w:w="3744"/>
+          </w:tcPr>
+          <w:p>
+            <w:r/>
+            <w:r>
+              <w:rPr>
+                <w:sz w:val="19"/>
+              </w:rPr>
+              <w:t>TaskRecorder asks for a Google or OTA sign-in</w:t>
+            </w:r>
+          </w:p>
+        </w:tc>
+        <w:tc>
+          <w:tcPr>
+            <w:tcW w:type="dxa" w:w="5616"/>
+          </w:tcPr>
+          <w:p>
+            <w:r/>
+            <w:r>
+              <w:rPr>
+                <w:sz w:val="19"/>
+              </w:rPr>
+              <w:t>You have an old version. Quit every copy with Command + Q, install TaskRecorder2.4.4.dmg from Important Links and choose Replace, then reopen it. If the prompt stays, ask Loki in #odin--helpdesk with the file name and a redacted screenshot.</w:t>
+            </w:r>
+          </w:p>
+        </w:tc>
+      </w:tr>
+      <w:tr>
+        <w:tc>
+          <w:tcPr>
+            <w:tcW w:type="dxa" w:w="3744"/>
+          </w:tcPr>
+          <w:p>
+            <w:r/>
+            <w:r>
+              <w:rPr>
+                <w:sz w:val="19"/>
+              </w:rPr>
               <w:t>The pointer has been still for about 20 seconds</w:t>
             </w:r>
           </w:p>
@@ -4951,7 +5258,7 @@
               <w:rPr>
                 <w:sz w:val="19"/>
               </w:rPr>
-              <w:t>Restart the recording.</w:t>
+              <w:t>A notification or personal name: restart the recording. A brief glimpse of a project name alone is tolerated, but avoid it.</w:t>
             </w:r>
           </w:p>
         </w:tc>
@@ -5005,7 +5312,7 @@
         <w:spacing w:after="120"/>
       </w:pPr>
       <w:r>
-        <w:t>Each rule below comes from your Review Lessons file, the Writer Guidelines or the guide PDF, and the right column says where this script satisfies it.</w:t>
+        <w:t>Each rule comes from your Review Lessons file, the updated Writer Guidelines (Oct 19), the Reviewer Guidelines, the QC checklist or App_Policy.md. The right column says where this script satisfies it.</w:t>
       </w:r>
     </w:p>
     <w:tbl>
@@ -5086,7 +5393,7 @@
               <w:rPr>
                 <w:sz w:val="19"/>
               </w:rPr>
-              <w:t>Review Lessons 4.1, Guidelines</w:t>
+              <w:t>Review Lessons 4.1; Writer Guidelines</w:t>
             </w:r>
           </w:p>
         </w:tc>
@@ -5100,7 +5407,7 @@
               <w:rPr>
                 <w:sz w:val="19"/>
               </w:rPr>
-              <w:t>Pause 1 second after every click</w:t>
+              <w:t>Pause about 1 second after every click</w:t>
             </w:r>
           </w:p>
         </w:tc>
@@ -5114,7 +5421,7 @@
               <w:rPr>
                 <w:sz w:val="19"/>
               </w:rPr>
-              <w:t>Rule 2 above, and the DO lines</w:t>
+              <w:t>Rule 2, and the DO lines</w:t>
             </w:r>
           </w:p>
         </w:tc>
@@ -5174,7 +5481,7 @@
               <w:rPr>
                 <w:sz w:val="19"/>
               </w:rPr>
-              <w:t>Review Lessons A, 4.2</w:t>
+              <w:t>Writer Guidelines (Narration); QC items 3 and 4</w:t>
             </w:r>
           </w:p>
         </w:tc>
@@ -5188,7 +5495,7 @@
               <w:rPr>
                 <w:sz w:val="19"/>
               </w:rPr>
-              <w:t>Say what, where and why, with the exact control and its place</w:t>
+              <w:t>What, where and why for every action; eyes-closed test; no 'this', 'that' or 'here'</w:t>
             </w:r>
           </w:p>
         </w:tc>
@@ -5202,7 +5509,7 @@
               <w:rPr>
                 <w:sz w:val="19"/>
               </w:rPr>
-              <w:t>Every SAY line</w:t>
+              <w:t>Every SAY line; typed text is read back; every table cell click is named</w:t>
             </w:r>
           </w:p>
         </w:tc>
@@ -5218,7 +5525,7 @@
               <w:rPr>
                 <w:sz w:val="19"/>
               </w:rPr>
-              <w:t>Review Lessons 4.5, Guidelines</w:t>
+              <w:t>Review Lessons 4.5; Writer Guidelines</w:t>
             </w:r>
           </w:p>
         </w:tc>
@@ -5232,7 +5539,7 @@
               <w:rPr>
                 <w:sz w:val="19"/>
               </w:rPr>
-              <w:t>Say every keyboard shortcut aloud</w:t>
+              <w:t>Announce every keyboard shortcut</w:t>
             </w:r>
           </w:p>
         </w:tc>
@@ -5246,7 +5553,7 @@
               <w:rPr>
                 <w:sz w:val="19"/>
               </w:rPr>
-              <w:t>Command and S in 4.2, 5.2, 6.4, 7.4 and 8.1</w:t>
+              <w:t>Command and S in 2.1, 4.2, 5.2, 6.4, 7.4 and 8.1</w:t>
             </w:r>
           </w:p>
         </w:tc>
@@ -5262,7 +5569,7 @@
               <w:rPr>
                 <w:sz w:val="19"/>
               </w:rPr>
-              <w:t>Review Lessons 4.4, AutoQC</w:t>
+              <w:t>Review Lessons 4.4</w:t>
             </w:r>
           </w:p>
         </w:tc>
@@ -5306,7 +5613,7 @@
               <w:rPr>
                 <w:sz w:val="19"/>
               </w:rPr>
-              <w:t>Review Lessons 4.6, Guidelines</w:t>
+              <w:t>Writer Guidelines (Typing); reviewer digest</w:t>
             </w:r>
           </w:p>
         </w:tc>
@@ -5320,7 +5627,7 @@
               <w:rPr>
                 <w:sz w:val="19"/>
               </w:rPr>
-              <w:t>No typing, pointer idle or audio gap over 45 seconds; typing bursts short</w:t>
+              <w:t>Typing below 20 percent for this task (reviewers fail above 25 percent); no typing burst or idle over 45 seconds</w:t>
             </w:r>
           </w:p>
         </w:tc>
@@ -5335,6 +5642,50 @@
                 <w:sz w:val="19"/>
               </w:rPr>
               <w:t>Typing counter, rule 4, the problem table</w:t>
+            </w:r>
+          </w:p>
+        </w:tc>
+      </w:tr>
+      <w:tr>
+        <w:tc>
+          <w:tcPr>
+            <w:tcW w:type="dxa" w:w="2304"/>
+          </w:tcPr>
+          <w:p>
+            <w:r/>
+            <w:r>
+              <w:rPr>
+                <w:sz w:val="19"/>
+              </w:rPr>
+              <w:t>Writer Guidelines; Reviewer Guidelines (Mouse)</w:t>
+            </w:r>
+          </w:p>
+        </w:tc>
+        <w:tc>
+          <w:tcPr>
+            <w:tcW w:type="dxa" w:w="3600"/>
+          </w:tcPr>
+          <w:p>
+            <w:r/>
+            <w:r>
+              <w:rPr>
+                <w:sz w:val="19"/>
+              </w:rPr>
+              <w:t>Pointer never idle over 45 seconds outside the epilogue; the epilogue may be still</w:t>
+            </w:r>
+          </w:p>
+        </w:tc>
+        <w:tc>
+          <w:tcPr>
+            <w:tcW w:type="dxa" w:w="3456"/>
+          </w:tcPr>
+          <w:p>
+            <w:r/>
+            <w:r>
+              <w:rPr>
+                <w:sz w:val="19"/>
+              </w:rPr>
+              <w:t>Rule 1; Part 9</w:t>
             </w:r>
           </w:p>
         </w:tc>
@@ -5438,7 +5789,7 @@
               <w:rPr>
                 <w:sz w:val="19"/>
               </w:rPr>
-              <w:t>Review Lessons 4.9, Guidelines</w:t>
+              <w:t>Writer Guidelines (AI-prepared inputs)</w:t>
             </w:r>
           </w:p>
         </w:tc>
@@ -5452,7 +5803,7 @@
               <w:rPr>
                 <w:sz w:val="19"/>
               </w:rPr>
-              <w:t>Say that prepared inputs are free of royalties and copyright</w:t>
+              <w:t>At first use, say each prepared file's contents, purpose and CC0 or public domain status, without naming a tool</w:t>
             </w:r>
           </w:p>
         </w:tc>
@@ -5466,7 +5817,7 @@
               <w:rPr>
                 <w:sz w:val="19"/>
               </w:rPr>
-              <w:t>Steps 2.2, 2.3, 6.1 and 7.1, without naming how the files were made</w:t>
+              <w:t>Steps 2.2, 2.3, 6.1 and 7.1</w:t>
             </w:r>
           </w:p>
         </w:tc>
@@ -5554,7 +5905,7 @@
               <w:rPr>
                 <w:sz w:val="19"/>
               </w:rPr>
-              <w:t>Before-you-record item 7</w:t>
+              <w:t>Before-you-record item 9</w:t>
             </w:r>
           </w:p>
         </w:tc>
@@ -5614,7 +5965,7 @@
               <w:rPr>
                 <w:sz w:val="19"/>
               </w:rPr>
-              <w:t>Review Lessons 2, 5, AutoQC</w:t>
+              <w:t>Review Lessons 2 and 5; QC item 5</w:t>
             </w:r>
           </w:p>
         </w:tc>
@@ -5642,7 +5993,7 @@
               <w:rPr>
                 <w:sz w:val="19"/>
               </w:rPr>
-              <w:t>Item 1; Part 3 to 8 show every part of the Goal: duty, temperature difference, U, 5 percent balance check, 20 percent limit, trend, memo, two slides, PDF</w:t>
+              <w:t>Item 1; Parts 3 to 8 show every part of the Goal: duty, temperature difference, U, 5 percent balance check, 20 percent limit, trend, memo, two slides, PDF</w:t>
             </w:r>
           </w:p>
         </w:tc>
@@ -5658,7 +6009,7 @@
               <w:rPr>
                 <w:sz w:val="19"/>
               </w:rPr>
-              <w:t>Review Lessons 2, Guidelines</w:t>
+              <w:t>Writer Guidelines (Intro); QC items 7 and 8</w:t>
             </w:r>
           </w:p>
         </w:tc>
@@ -5672,7 +6023,7 @@
               <w:rPr>
                 <w:sz w:val="19"/>
               </w:rPr>
-              <w:t>Intro is only the one sentence, under 20 seconds, Goal shown then minimized</w:t>
+              <w:t>Goal document shown at the start; intro is only the one sentence, under 20 seconds; then minimize or close it</w:t>
             </w:r>
           </w:p>
         </w:tc>
@@ -5702,7 +6053,7 @@
               <w:rPr>
                 <w:sz w:val="19"/>
               </w:rPr>
-              <w:t>Guidelines, Restricted Apps</w:t>
+              <w:t>App_Policy.md; Writer Guidelines (Apps)</w:t>
             </w:r>
           </w:p>
         </w:tc>
@@ -5716,7 +6067,7 @@
               <w:rPr>
                 <w:sz w:val="19"/>
               </w:rPr>
-              <w:t>No restricted apps; at least 3 genuine apps</w:t>
+              <w:t>No banned app; a single app is allowed and 2 to 3 are suggested; Insightful background only</w:t>
             </w:r>
           </w:p>
         </w:tc>
@@ -5730,7 +6081,7 @@
               <w:rPr>
                 <w:sz w:val="19"/>
               </w:rPr>
-              <w:t>Visual Studio Code, Word and PowerPoint each produce part of the result; Terminal is used only after recording</w:t>
+              <w:t>Item 4; all three apps do real work</w:t>
             </w:r>
           </w:p>
         </w:tc>
@@ -5746,7 +6097,7 @@
               <w:rPr>
                 <w:sz w:val="19"/>
               </w:rPr>
-              <w:t>Guidelines, Window Management</w:t>
+              <w:t>Writer Guidelines (Window Management); QC item 2</w:t>
             </w:r>
           </w:p>
         </w:tc>
@@ -5760,7 +6111,7 @@
               <w:rPr>
                 <w:sz w:val="19"/>
               </w:rPr>
-              <w:t>One ordinary window, no Full Screen, no windows covered by more than 25 percent</w:t>
+              <w:t>No unused window covering more than 25 percent of another for more than 6 seconds; no Full Screen</w:t>
             </w:r>
           </w:p>
         </w:tc>
@@ -5790,7 +6141,7 @@
               <w:rPr>
                 <w:sz w:val="19"/>
               </w:rPr>
-              <w:t>Guidelines, Desktop</w:t>
+              <w:t>Writer Guidelines (Technical Setup, Parts A and B)</w:t>
             </w:r>
           </w:p>
         </w:tc>
@@ -5804,7 +6155,7 @@
               <w:rPr>
                 <w:sz w:val="19"/>
               </w:rPr>
-              <w:t>Dock left or right, clock with seconds, wallpaper changed, default cursor, Accessibility Inspector dot</w:t>
+              <w:t>Cleared Desktop, built-in wallpaper, Do Not Disturb, neutral Mac name, quit unused apps, test recording</w:t>
             </w:r>
           </w:p>
         </w:tc>
@@ -5818,7 +6169,7 @@
               <w:rPr>
                 <w:sz w:val="19"/>
               </w:rPr>
-              <w:t>Before-you-record item 6</w:t>
+              <w:t>Items 4, 6, 7 and 11</w:t>
             </w:r>
           </w:p>
         </w:tc>
@@ -5834,7 +6185,139 @@
               <w:rPr>
                 <w:sz w:val="19"/>
               </w:rPr>
-              <w:t>Guidelines, AI use</w:t>
+              <w:t>Writer Guidelines (Desktop); Reviewer Guidelines</w:t>
+            </w:r>
+          </w:p>
+        </w:tc>
+        <w:tc>
+          <w:tcPr>
+            <w:tcW w:type="dxa" w:w="3600"/>
+          </w:tcPr>
+          <w:p>
+            <w:r/>
+            <w:r>
+              <w:rPr>
+                <w:sz w:val="19"/>
+              </w:rPr>
+              <w:t>Dock left or right, visible at start and end, auto-hide off; clock with seconds; one real UI change; default cursor; Accessibility Inspector dot</w:t>
+            </w:r>
+          </w:p>
+        </w:tc>
+        <w:tc>
+          <w:tcPr>
+            <w:tcW w:type="dxa" w:w="3456"/>
+          </w:tcPr>
+          <w:p>
+            <w:r/>
+            <w:r>
+              <w:rPr>
+                <w:sz w:val="19"/>
+              </w:rPr>
+              <w:t>Item 7</w:t>
+            </w:r>
+          </w:p>
+        </w:tc>
+      </w:tr>
+      <w:tr>
+        <w:tc>
+          <w:tcPr>
+            <w:tcW w:type="dxa" w:w="2304"/>
+          </w:tcPr>
+          <w:p>
+            <w:r/>
+            <w:r>
+              <w:rPr>
+                <w:sz w:val="19"/>
+              </w:rPr>
+              <w:t>Writer Guidelines (PII); Reviewer Guidelines (PII)</w:t>
+            </w:r>
+          </w:p>
+        </w:tc>
+        <w:tc>
+          <w:tcPr>
+            <w:tcW w:type="dxa" w:w="3600"/>
+          </w:tcPr>
+          <w:p>
+            <w:r/>
+            <w:r>
+              <w:rPr>
+                <w:sz w:val="19"/>
+              </w:rPr>
+              <w:t>No name, photo or email in app corners, Save windows or the sidebar; PII is never tolerated</w:t>
+            </w:r>
+          </w:p>
+        </w:tc>
+        <w:tc>
+          <w:tcPr>
+            <w:tcW w:type="dxa" w:w="3456"/>
+          </w:tcPr>
+          <w:p>
+            <w:r/>
+            <w:r>
+              <w:rPr>
+                <w:sz w:val="19"/>
+              </w:rPr>
+              <w:t>Items 5 and 6, rule 5, the note in 8.2, After-recording item 2</w:t>
+            </w:r>
+          </w:p>
+        </w:tc>
+      </w:tr>
+      <w:tr>
+        <w:tc>
+          <w:tcPr>
+            <w:tcW w:type="dxa" w:w="2304"/>
+          </w:tcPr>
+          <w:p>
+            <w:r/>
+            <w:r>
+              <w:rPr>
+                <w:sz w:val="19"/>
+              </w:rPr>
+              <w:t>Writer Guidelines (Accounts)</w:t>
+            </w:r>
+          </w:p>
+        </w:tc>
+        <w:tc>
+          <w:tcPr>
+            <w:tcW w:type="dxa" w:w="3600"/>
+          </w:tcPr>
+          <w:p>
+            <w:r/>
+            <w:r>
+              <w:rPr>
+                <w:sz w:val="19"/>
+              </w:rPr>
+              <w:t>No OTA accounts; mercor.expert or anonymised account for task apps; TaskRecorder 2.4.4 has no sign-in</w:t>
+            </w:r>
+          </w:p>
+        </w:tc>
+        <w:tc>
+          <w:tcPr>
+            <w:tcW w:type="dxa" w:w="3456"/>
+          </w:tcPr>
+          <w:p>
+            <w:r/>
+            <w:r>
+              <w:rPr>
+                <w:sz w:val="19"/>
+              </w:rPr>
+              <w:t>Item 5</w:t>
+            </w:r>
+          </w:p>
+        </w:tc>
+      </w:tr>
+      <w:tr>
+        <w:tc>
+          <w:tcPr>
+            <w:tcW w:type="dxa" w:w="2304"/>
+          </w:tcPr>
+          <w:p>
+            <w:r/>
+            <w:r>
+              <w:rPr>
+                <w:sz w:val="19"/>
+              </w:rPr>
+              <w:t>Writer Guidelines (AI use)</w:t>
             </w:r>
           </w:p>
         </w:tc>
@@ -5878,7 +6361,7 @@
               <w:rPr>
                 <w:sz w:val="19"/>
               </w:rPr>
-              <w:t>Guidelines, PII and project references</w:t>
+              <w:t>Writer Guidelines (Epilogue); QC item 20</w:t>
             </w:r>
           </w:p>
         </w:tc>
@@ -5892,7 +6375,7 @@
               <w:rPr>
                 <w:sz w:val="19"/>
               </w:rPr>
-              <w:t>Nothing from Studio, Slack, Mercor or the guide on screen; Metadata.rtf closed</w:t>
+              <w:t>Epilogue of 3 to 4 minutes, maximum 4:00, six topics, after the work and before TaskRecorder returns</w:t>
             </w:r>
           </w:p>
         </w:tc>
@@ -5906,7 +6389,7 @@
               <w:rPr>
                 <w:sz w:val="19"/>
               </w:rPr>
-              <w:t>Items 1 and 6</w:t>
+              <w:t>Part 9, item 12</w:t>
             </w:r>
           </w:p>
         </w:tc>
@@ -5922,7 +6405,7 @@
               <w:rPr>
                 <w:sz w:val="19"/>
               </w:rPr>
-              <w:t>Task page (new), AutoQC</w:t>
+              <w:t>Writer Guidelines (length)</w:t>
             </w:r>
           </w:p>
         </w:tc>
@@ -5936,7 +6419,7 @@
               <w:rPr>
                 <w:sz w:val="19"/>
               </w:rPr>
-              <w:t>Epilogue of 3 to 4 minutes, maximum 4:00, after the work and before TaskRecorder returns</w:t>
+              <w:t>Plan 15:00 to 50:59 including intro and epilogue (reviewers accept up to 54:59)</w:t>
             </w:r>
           </w:p>
         </w:tc>
@@ -5950,7 +6433,7 @@
               <w:rPr>
                 <w:sz w:val="19"/>
               </w:rPr>
-              <w:t>Part 9</w:t>
+              <w:t>Planned finish near 37:45</w:t>
             </w:r>
           </w:p>
         </w:tc>
@@ -5966,7 +6449,7 @@
               <w:rPr>
                 <w:sz w:val="19"/>
               </w:rPr>
-              <w:t>Task page (new)</w:t>
+              <w:t>Writer Guidelines (AutoQC)</w:t>
             </w:r>
           </w:p>
         </w:tc>
@@ -5980,7 +6463,7 @@
               <w:rPr>
                 <w:sz w:val="19"/>
               </w:rPr>
-              <w:t>Length 15:00 to 50:59 including intro and epilogue</w:t>
+              <w:t>Only Major flags block submission; file problems need a corrected upload, not a re-record</w:t>
             </w:r>
           </w:p>
         </w:tc>
@@ -5994,7 +6477,7 @@
               <w:rPr>
                 <w:sz w:val="19"/>
               </w:rPr>
-              <w:t>Planned finish near 36:54</w:t>
+              <w:t>After-recording item 6</w:t>
             </w:r>
           </w:p>
         </w:tc>
@@ -6010,7 +6493,7 @@
               <w:rPr>
                 <w:sz w:val="19"/>
               </w:rPr>
-              <w:t>Guidelines, Output</w:t>
+              <w:t>Writer Guidelines (Output)</w:t>
             </w:r>
           </w:p>
         </w:tc>
@@ -6024,7 +6507,7 @@
               <w:rPr>
                 <w:sz w:val="19"/>
               </w:rPr>
-              <w:t>Deliverables.zip named input N, final output N with spaces, Metadata.rtf outside</w:t>
+              <w:t>Deliverables.zip with input N, final output N and extensions, Metadata.rtf outside</w:t>
             </w:r>
           </w:p>
         </w:tc>
@@ -6048,6 +6531,14 @@
       <w:pPr>
         <w:spacing w:after="40"/>
       </w:pPr>
+    </w:p>
+    <w:p>
+      <w:pPr>
+        <w:spacing w:after="120"/>
+      </w:pPr>
+      <w:r>
+        <w:t>Reviewers apply wider tolerances than the writer rules, for example silence up to 60 seconds, typing up to 25 percent, window overlap of 6 to 30 seconds as a growth note, and video up to 54:59. This script plans to the stricter writer limits because they are the safer target, and because items at the edge of tolerance can still fail.</w:t>
+      </w:r>
     </w:p>
     <w:p>
       <w:pPr>

</xml_diff>

<commit_message>
Task pack: add units and axis narration, put 3-day safety margin in the typed memo recommendation
Co-Authored-By: Claude Sonnet 5.5 <noreply@anthropic.com>
Claude-Session: https://claude.ai/code/session_01Gm6cMKt8gvcTBmYZnmf5pq
</commit_message>
<xml_diff>
--- a/task-pack/E-101 Fouling Check - Timed Script.docx
+++ b/task-pack/E-101 Fouling Check - Timed Script.docx
@@ -31,7 +31,7 @@
         <w:spacing w:after="120"/>
       </w:pPr>
       <w:r>
-        <w:t>This script has 20 minutes 15 seconds of speaking and doing, plus a separate epilogue of about 3:20. It is built for a video of about 38 minutes. Your earlier videos ran about 1.6 times the script time, and you will speak slowly with a pause after every click, so I planned the working part at 1.7 times. The epilogue is spoken only, so it is counted at real time. That keeps a wide margin above the 15:00 minimum and below the 50:59 planning limit. It uses the same layout as your droplet script, and it is written to avoid the mistakes reviewers flag, listed below.</w:t>
+        <w:t>This script has 20 minutes 45 seconds of speaking and doing, plus a separate epilogue of about 3:20. It is built for a video of about 39 minutes. Your earlier videos ran about 1.6 times the script time, and you will speak slowly with a pause after every click, so I planned the working part at 1.7 times. The epilogue is spoken only, so it is counted at real time. That keeps a wide margin above the 15:00 minimum and below the 50:59 planning limit. It uses the same layout as your droplet script, and it is written to avoid the mistakes reviewers flag, listed below.</w:t>
       </w:r>
     </w:p>
     <w:tbl>
@@ -167,7 +167,7 @@
               <w:rPr>
                 <w:sz w:val="19"/>
               </w:rPr>
-              <w:t>The task is small: 8 parts, 524 typed characters, three genuine apps, and most steps are pointer clicks and speaking. Almost every typed value is one placeholder in a prefilled cell. Pause one second after every click and one second between sentences.</w:t>
+              <w:t>The task is small: 8 parts, 518 typed characters, three genuine apps, and most steps are pointer clicks and speaking. Almost every typed value is one placeholder in a prefilled cell. Pause one second after every click and one second between sentences.</w:t>
             </w:r>
           </w:p>
         </w:tc>
@@ -785,7 +785,7 @@
               <w:rPr>
                 <w:sz w:val="19"/>
               </w:rPr>
-              <w:t>1:55</w:t>
+              <w:t>2:10</w:t>
             </w:r>
           </w:p>
         </w:tc>
@@ -799,7 +799,7 @@
               <w:rPr>
                 <w:sz w:val="19"/>
               </w:rPr>
-              <w:t>4:45</w:t>
+              <w:t>5:00</w:t>
             </w:r>
           </w:p>
         </w:tc>
@@ -813,7 +813,7 @@
               <w:rPr>
                 <w:sz w:val="19"/>
               </w:rPr>
-              <w:t>8:04</w:t>
+              <w:t>8:30</w:t>
             </w:r>
           </w:p>
         </w:tc>
@@ -857,7 +857,7 @@
               <w:rPr>
                 <w:sz w:val="19"/>
               </w:rPr>
-              <w:t>6:50</w:t>
+              <w:t>7:05</w:t>
             </w:r>
           </w:p>
         </w:tc>
@@ -871,7 +871,7 @@
               <w:rPr>
                 <w:sz w:val="19"/>
               </w:rPr>
-              <w:t>11:37</w:t>
+              <w:t>12:02</w:t>
             </w:r>
           </w:p>
         </w:tc>
@@ -901,7 +901,7 @@
               <w:rPr>
                 <w:sz w:val="19"/>
               </w:rPr>
-              <w:t>2:15</w:t>
+              <w:t>2:30</w:t>
             </w:r>
           </w:p>
         </w:tc>
@@ -915,7 +915,7 @@
               <w:rPr>
                 <w:sz w:val="19"/>
               </w:rPr>
-              <w:t>9:05</w:t>
+              <w:t>9:35</w:t>
             </w:r>
           </w:p>
         </w:tc>
@@ -929,7 +929,7 @@
               <w:rPr>
                 <w:sz w:val="19"/>
               </w:rPr>
-              <w:t>15:26</w:t>
+              <w:t>16:17</w:t>
             </w:r>
           </w:p>
         </w:tc>
@@ -973,7 +973,7 @@
               <w:rPr>
                 <w:sz w:val="19"/>
               </w:rPr>
-              <w:t>13:40</w:t>
+              <w:t>14:10</w:t>
             </w:r>
           </w:p>
         </w:tc>
@@ -987,7 +987,7 @@
               <w:rPr>
                 <w:sz w:val="19"/>
               </w:rPr>
-              <w:t>23:14</w:t>
+              <w:t>24:05</w:t>
             </w:r>
           </w:p>
         </w:tc>
@@ -1031,7 +1031,7 @@
               <w:rPr>
                 <w:sz w:val="19"/>
               </w:rPr>
-              <w:t>17:05</w:t>
+              <w:t>17:35</w:t>
             </w:r>
           </w:p>
         </w:tc>
@@ -1045,7 +1045,7 @@
               <w:rPr>
                 <w:sz w:val="19"/>
               </w:rPr>
-              <w:t>29:02</w:t>
+              <w:t>29:53</w:t>
             </w:r>
           </w:p>
         </w:tc>
@@ -1089,7 +1089,7 @@
               <w:rPr>
                 <w:sz w:val="19"/>
               </w:rPr>
-              <w:t>20:15</w:t>
+              <w:t>20:45</w:t>
             </w:r>
           </w:p>
         </w:tc>
@@ -1103,7 +1103,7 @@
               <w:rPr>
                 <w:sz w:val="19"/>
               </w:rPr>
-              <w:t>34:25</w:t>
+              <w:t>35:16</w:t>
             </w:r>
           </w:p>
         </w:tc>
@@ -1161,7 +1161,7 @@
               <w:rPr>
                 <w:sz w:val="19"/>
               </w:rPr>
-              <w:t>37:45 (finish)</w:t>
+              <w:t>38:36 (finish)</w:t>
             </w:r>
           </w:p>
         </w:tc>
@@ -1177,7 +1177,7 @@
         <w:spacing w:after="120"/>
       </w:pPr>
       <w:r>
-        <w:t>If you are more than 3 minutes behind a checkpoint, use the cut order in the last section right away. If you reach 36:00 and are not yet in Part 8, go straight to Part 8. The video must stay between 15:00 and 50:59, so a finish near 37:45 leaves about 13 minutes of safety.</w:t>
+        <w:t>If you are more than 3 minutes behind a checkpoint, use the cut order in the last section right away. If you reach 37:00 and are not yet in Part 8, go straight to Part 8. The video must stay between 15:00 and 50:59, so a finish near 38:36 leaves about 12 minutes of safety.</w:t>
       </w:r>
     </w:p>
     <w:p>
@@ -1503,7 +1503,7 @@
                 <w:b/>
                 <w:sz w:val="19"/>
               </w:rPr>
-              <w:t>Typing share at 38 minutes</w:t>
+              <w:t>Typing share at 39 minutes</w:t>
             </w:r>
           </w:p>
         </w:tc>
@@ -1739,7 +1739,7 @@
               <w:rPr>
                 <w:sz w:val="19"/>
               </w:rPr>
-              <w:t>14 %</w:t>
+              <w:t>13 %</w:t>
             </w:r>
           </w:p>
         </w:tc>
@@ -1827,7 +1827,7 @@
         <w:spacing w:after="120"/>
       </w:pPr>
       <w:r>
-        <w:t>These shares are estimates: 524 characters times your seconds per character, divided by the video length of about 38 minutes. I do not know exactly how AutoQC counts typing, so the test decides, not my table. The limit is strictly below 20 percent for this engineering task, and the AutoQC list says up to about 30 percent only for coding tasks.</w:t>
+        <w:t>These shares are estimates: 518 characters times your seconds per character, divided by the video length of about 39 minutes. I do not know exactly how AutoQC counts typing, so the test decides, not my table. The limit is strictly below 20 percent for this engineering task, and the AutoQC list says up to about 30 percent only for coding tasks.</w:t>
       </w:r>
     </w:p>
     <w:p>
@@ -2169,7 +2169,7 @@
         <w:pStyle w:val="Heading2"/>
       </w:pPr>
       <w:r>
-        <w:t>Part 3: Load and clean the data (2:50 to 4:45)</w:t>
+        <w:t>Part 3: Load and clean the data (2:50 to 5:00)</w:t>
       </w:r>
     </w:p>
     <w:p>
@@ -2243,7 +2243,7 @@
         <w:rPr>
           <w:b/>
         </w:rPr>
-        <w:t>3.2 Summarise every column (30 seconds)</w:t>
+        <w:t>3.2 Summarise every column (45 seconds)</w:t>
       </w:r>
     </w:p>
     <w:p>
@@ -2257,7 +2257,7 @@
         <w:t xml:space="preserve">DO: </w:t>
       </w:r>
       <w:r>
-        <w:t>Click the Run arrow at the left edge of the next cell. If rows are cut off, scroll the output with the mouse wheel. Rest the pointer on the hot_flow_kg_s row, then on the cold_flow_kg_s row.</w:t>
+        <w:t>Click the Run arrow at the left edge of the next cell. If rows are cut off, scroll the output with the mouse wheel. Rest the pointer on the hot_flow_kg_s row, then on the cold_flow_kg_s row. Then rest it on the unit endings _kg_s, _kJ_kgK and _C in the column names.</w:t>
       </w:r>
     </w:p>
     <w:p>
@@ -2271,7 +2271,7 @@
         <w:t xml:space="preserve">SAY: </w:t>
       </w:r>
       <w:r>
-        <w:t>"I'm clicking the Run arrow at the left edge of the next cell, which summarises every column. In the hot_flow row I'm pointing at the mean, 11.9 kilograms per second, and the minimum, only 0.023. The cold_flow row shows the same pattern. Flows near zero mean the exchanger was not running, and those hours would give meaningless coefficients."</w:t>
+        <w:t>"I'm clicking the Run arrow at the left edge of the next cell, which summarises every column. In the hot_flow row I'm pointing at the mean, 11.9 kilograms per second, and the minimum, only 0.023. The cold_flow row shows the same pattern. Flows near zero mean the exchanger was not running, and those hours would give meaningless coefficients. The column names carry the units: flows in kilograms per second, specific heat in kilojoules per kilogram kelvin, and temperatures in degrees Celsius, so duty comes out in kilowatts and U in watts per square metre kelvin."</w:t>
       </w:r>
     </w:p>
     <w:p>
@@ -2358,7 +2358,7 @@
         <w:pStyle w:val="Heading2"/>
       </w:pPr>
       <w:r>
-        <w:t>Part 4: Duty, temperature difference, U and the energy balance (4:45 to 6:50)</w:t>
+        <w:t>Part 4: Duty, temperature difference, U and the energy balance (5:00 to 7:05)</w:t>
       </w:r>
     </w:p>
     <w:p>
@@ -2549,7 +2549,7 @@
         <w:pStyle w:val="Heading2"/>
       </w:pPr>
       <w:r>
-        <w:t>Part 5: Fouling limit, trend and chart (6:50 to 9:05)</w:t>
+        <w:t>Part 5: Fouling limit, trend and chart (7:05 to 9:35)</w:t>
       </w:r>
     </w:p>
     <w:p>
@@ -2687,7 +2687,7 @@
         <w:rPr>
           <w:b/>
         </w:rPr>
-        <w:t>5.2 Trend line, crossing day and chart (1 minute 15 seconds)</w:t>
+        <w:t>5.2 Trend line, crossing day and chart (1 minute 30 seconds)</w:t>
       </w:r>
     </w:p>
     <w:p>
@@ -2743,7 +2743,7 @@
         <w:t xml:space="preserve">DO: </w:t>
       </w:r>
       <w:r>
-        <w:t>Scroll down with the mouse wheel until the chart is fully in view. Trace the blue dots from left to right, then the blue trend line, then rest on the red dashed line and the dotted vertical line. Press Command + S. Click the yellow button in the top left corner of the VS Code window.</w:t>
+        <w:t>Scroll down with the mouse wheel until the chart is fully in view. Rest the pointer on the two axis labels and the legend. Trace the blue dots from left to right, then the blue trend line, then rest on the red dashed line and the dotted vertical line. Press Command + S. Click the yellow button in the top left corner of the VS Code window.</w:t>
       </w:r>
     </w:p>
     <w:p>
@@ -2757,7 +2757,7 @@
         <w:t xml:space="preserve">SAY: </w:t>
       </w:r>
       <w:r>
-        <w:t>"I'm scrolling down with the mouse wheel until the chart is fully in view. I'm tracing the blue dots, which fall from about 500 to about 428, then the blue trend line continuing past the data, then the red dashed limit at 396.9 and the dotted vertical line where they meet, near day 42."</w:t>
+        <w:t>"I'm scrolling down with the mouse wheel until the chart is fully in view. I'm reading the labels: days since 1 September on the horizontal axis, the overall coefficient in watts per square metre kelvin on the vertical axis, and a legend naming the limit. I'm tracing the blue dots, which fall from about 500 to about 428, then the blue trend line continuing past the data, then the red dashed limit at 396.9 and the dotted vertical line where they meet, near day 42."</w:t>
       </w:r>
     </w:p>
     <w:p>
@@ -2779,7 +2779,7 @@
         <w:pStyle w:val="Heading2"/>
       </w:pPr>
       <w:r>
-        <w:t>Part 6: Maintenance memo in Word (9:05 to 13:40)</w:t>
+        <w:t>Part 6: Maintenance memo in Word (9:35 to 14:10)</w:t>
       </w:r>
     </w:p>
     <w:p>
@@ -3136,7 +3136,7 @@
         <w:t xml:space="preserve">SAY, before typing: </w:t>
       </w:r>
       <w:r>
-        <w:t>"I'm clicking the empty line under heading 4, Recommendation. I will type the decision and the date. The margin I will say aloud: Friday 9 October is three days before the predicted crossing, because a straight-line trend is only an estimate."</w:t>
+        <w:t>"I'm clicking the empty line under heading 4, Recommendation. I will type the decision, the date and the safety margin: Friday 9 October is three days before the predicted crossing, because a straight-line trend is only an estimate."</w:t>
       </w:r>
     </w:p>
     <w:p>
@@ -3161,7 +3161,7 @@
         <w:shd w:val="clear" w:color="auto" w:fill="F2F2F2"/>
       </w:pPr>
       <w:r>
-        <w:t>Clean E-101 at the next planned shutdown, no later than Friday 9 October 2026.</w:t>
+        <w:t>Clean E-101 by Friday 9 October 2026, which keeps a 3-day safety margin.</w:t>
       </w:r>
     </w:p>
     <w:p>
@@ -3175,7 +3175,7 @@
         <w:t xml:space="preserve">SAY: </w:t>
       </w:r>
       <w:r>
-        <w:t>"The sentence reads: clean E-101 at the next planned shutdown, no later than Friday 9 October 2026. That is three days before Monday 12 October."</w:t>
+        <w:t>"The sentence reads: clean E-101 by Friday 9 October 2026, which keeps a 3-day safety margin. That is three days before the predicted crossing on Monday 12 October."</w:t>
       </w:r>
     </w:p>
     <w:p>
@@ -3211,7 +3211,7 @@
         <w:pStyle w:val="Heading2"/>
       </w:pPr>
       <w:r>
-        <w:t>Part 7: Two-slide briefing in PowerPoint (13:40 to 17:05)</w:t>
+        <w:t>Part 7: Two-slide briefing in PowerPoint (14:10 to 17:35)</w:t>
       </w:r>
     </w:p>
     <w:p>
@@ -3621,7 +3621,7 @@
         <w:pStyle w:val="Heading2"/>
       </w:pPr>
       <w:r>
-        <w:t>Part 8: Verify, cross-check and close (17:05 to 20:15)</w:t>
+        <w:t>Part 8: Verify, cross-check and close (17:35 to 20:45)</w:t>
       </w:r>
     </w:p>
     <w:p>
@@ -4163,7 +4163,7 @@
         <w:spacing w:after="120"/>
       </w:pPr>
       <w:r>
-        <w:t>Total typed: 524 characters. The longest single burst is the summary sentence of 102 characters, about 26 seconds at 0.25 seconds per character, or 36 seconds at 0.35. Every other burst is shorter.</w:t>
+        <w:t>Total typed: 518 characters. The longest single burst is the summary sentence of 102 characters, about 26 seconds at 0.25 seconds per character, or 36 seconds at 0.35. Every other burst is shorter.</w:t>
       </w:r>
     </w:p>
     <w:tbl>
@@ -4299,7 +4299,7 @@
               <w:rPr>
                 <w:sz w:val="19"/>
               </w:rPr>
-              <w:t>236</w:t>
+              <w:t>230</w:t>
             </w:r>
           </w:p>
         </w:tc>
@@ -4359,7 +4359,7 @@
               <w:rPr>
                 <w:sz w:val="19"/>
               </w:rPr>
-              <w:t>524</w:t>
+              <w:t>518</w:t>
             </w:r>
           </w:p>
         </w:tc>
@@ -6433,7 +6433,7 @@
               <w:rPr>
                 <w:sz w:val="19"/>
               </w:rPr>
-              <w:t>Planned finish near 37:45</w:t>
+              <w:t>Planned finish near 38:36</w:t>
             </w:r>
           </w:p>
         </w:tc>
@@ -6839,7 +6839,7 @@
               <w:rPr>
                 <w:sz w:val="19"/>
               </w:rPr>
-              <w:t>no later than Friday 9 October 2026, three days before the crossing</w:t>
+              <w:t>by Friday 9 October 2026, which keeps a 3-day safety margin before the crossing</w:t>
             </w:r>
           </w:p>
         </w:tc>

</xml_diff>